<commit_message>
Manual para auditores: versión de ejecución local (acceso, túnel y verificación en la GNS3 VM)
</commit_message>
<xml_diff>
--- a/docs/entregables/Manual_Simulaciones_Auditoria.docx
+++ b/docs/entregables/Manual_Simulaciones_Auditoria.docx
@@ -49,7 +49,7 @@
           <w:sz w:val="26"/>
           <w:szCs w:val="26"/>
         </w:rPr>
-        <w:t>Documento para el equipo auditor</w:t>
+        <w:t>Documento para el equipo auditor · Ejecución local del laboratorio</w:t>
       </w:r>
     </w:p>
     <w:p>
@@ -157,7 +157,7 @@
           <w:szCs w:val="22"/>
         </w:rPr>
         <w:tab/>
-        <w:t>1.0, octubre de 2026</w:t>
+        <w:t>1.0, ejecución local, octubre de 2026</w:t>
       </w:r>
     </w:p>
     <w:p>
@@ -211,7 +211,7 @@
     <w:sdt>
       <w:sdtPr>
         <w:alias w:val="Contenido"/>
-        <w:id w:val="347691895"/>
+        <w:id w:val="-372467021"/>
       </w:sdtPr>
       <w:sdtEndPr/>
       <w:sdtContent>
@@ -234,7 +234,7 @@
           <w:r>
             <w:fldChar w:fldCharType="separate"/>
           </w:r>
-          <w:hyperlink w:anchor="_Toc242517532" w:history="1">
+          <w:hyperlink w:anchor="_Toc242520258" w:history="1">
             <w:r>
               <w:rPr>
                 <w:rStyle w:val="Hipervnculo"/>
@@ -258,7 +258,7 @@
               <w:rPr>
                 <w:noProof/>
               </w:rPr>
-              <w:instrText xml:space="preserve"> PAGEREF _Toc242517532 \h </w:instrText>
+              <w:instrText xml:space="preserve"> PAGEREF _Toc242520258 \h </w:instrText>
             </w:r>
             <w:r>
               <w:rPr>
@@ -295,7 +295,7 @@
               <w:noProof/>
             </w:rPr>
           </w:pPr>
-          <w:hyperlink w:anchor="_Toc242517533" w:history="1">
+          <w:hyperlink w:anchor="_Toc242520259" w:history="1">
             <w:r>
               <w:rPr>
                 <w:rStyle w:val="Hipervnculo"/>
@@ -319,7 +319,7 @@
               <w:rPr>
                 <w:noProof/>
               </w:rPr>
-              <w:instrText xml:space="preserve"> PAGEREF _Toc242517533 \h </w:instrText>
+              <w:instrText xml:space="preserve"> PAGEREF _Toc242520259 \h </w:instrText>
             </w:r>
             <w:r>
               <w:rPr>
@@ -356,7 +356,7 @@
               <w:noProof/>
             </w:rPr>
           </w:pPr>
-          <w:hyperlink w:anchor="_Toc242517534" w:history="1">
+          <w:hyperlink w:anchor="_Toc242520260" w:history="1">
             <w:r>
               <w:rPr>
                 <w:rStyle w:val="Hipervnculo"/>
@@ -380,7 +380,7 @@
               <w:rPr>
                 <w:noProof/>
               </w:rPr>
-              <w:instrText xml:space="preserve"> PAGEREF _Toc242517534 \h </w:instrText>
+              <w:instrText xml:space="preserve"> PAGEREF _Toc242520260 \h </w:instrText>
             </w:r>
             <w:r>
               <w:rPr>
@@ -417,13 +417,13 @@
               <w:noProof/>
             </w:rPr>
           </w:pPr>
-          <w:hyperlink w:anchor="_Toc242517535" w:history="1">
+          <w:hyperlink w:anchor="_Toc242520261" w:history="1">
             <w:r>
               <w:rPr>
                 <w:rStyle w:val="Hipervnculo"/>
                 <w:noProof/>
               </w:rPr>
-              <w:t>3.1 Cuentas necesarias</w:t>
+              <w:t>3.1 Ejecución local</w:t>
             </w:r>
             <w:r>
               <w:rPr>
@@ -441,7 +441,7 @@
               <w:rPr>
                 <w:noProof/>
               </w:rPr>
-              <w:instrText xml:space="preserve"> PAGEREF _Toc242517535 \h </w:instrText>
+              <w:instrText xml:space="preserve"> PAGEREF _Toc242520261 \h </w:instrText>
             </w:r>
             <w:r>
               <w:rPr>
@@ -478,13 +478,13 @@
               <w:noProof/>
             </w:rPr>
           </w:pPr>
-          <w:hyperlink w:anchor="_Toc242517536" w:history="1">
+          <w:hyperlink w:anchor="_Toc242520262" w:history="1">
             <w:r>
               <w:rPr>
                 <w:rStyle w:val="Hipervnculo"/>
                 <w:noProof/>
               </w:rPr>
-              <w:t>3.2 Estado inicial limpio</w:t>
+              <w:t>3.2 Cuentas necesarias</w:t>
             </w:r>
             <w:r>
               <w:rPr>
@@ -502,7 +502,7 @@
               <w:rPr>
                 <w:noProof/>
               </w:rPr>
-              <w:instrText xml:space="preserve"> PAGEREF _Toc242517536 \h </w:instrText>
+              <w:instrText xml:space="preserve"> PAGEREF _Toc242520262 \h </w:instrText>
             </w:r>
             <w:r>
               <w:rPr>
@@ -539,13 +539,13 @@
               <w:noProof/>
             </w:rPr>
           </w:pPr>
-          <w:hyperlink w:anchor="_Toc242517537" w:history="1">
+          <w:hyperlink w:anchor="_Toc242520263" w:history="1">
             <w:r>
               <w:rPr>
                 <w:rStyle w:val="Hipervnculo"/>
                 <w:noProof/>
               </w:rPr>
-              <w:t>3.3 Cómo se registra la evidencia</w:t>
+              <w:t>3.3 Estado inicial limpio</w:t>
             </w:r>
             <w:r>
               <w:rPr>
@@ -563,7 +563,7 @@
               <w:rPr>
                 <w:noProof/>
               </w:rPr>
-              <w:instrText xml:space="preserve"> PAGEREF _Toc242517537 \h </w:instrText>
+              <w:instrText xml:space="preserve"> PAGEREF _Toc242520263 \h </w:instrText>
             </w:r>
             <w:r>
               <w:rPr>
@@ -581,6 +581,67 @@
                 <w:noProof/>
               </w:rPr>
               <w:t>5</w:t>
+            </w:r>
+            <w:r>
+              <w:rPr>
+                <w:noProof/>
+              </w:rPr>
+              <w:fldChar w:fldCharType="end"/>
+            </w:r>
+          </w:hyperlink>
+        </w:p>
+        <w:p>
+          <w:pPr>
+            <w:pStyle w:val="TDC2"/>
+            <w:tabs>
+              <w:tab w:val="right" w:leader="dot" w:pos="10070"/>
+            </w:tabs>
+            <w:rPr>
+              <w:noProof/>
+            </w:rPr>
+          </w:pPr>
+          <w:hyperlink w:anchor="_Toc242520264" w:history="1">
+            <w:r>
+              <w:rPr>
+                <w:rStyle w:val="Hipervnculo"/>
+                <w:noProof/>
+              </w:rPr>
+              <w:t>3.4 Cómo se registra la evidencia</w:t>
+            </w:r>
+            <w:r>
+              <w:rPr>
+                <w:noProof/>
+              </w:rPr>
+              <w:tab/>
+            </w:r>
+            <w:r>
+              <w:rPr>
+                <w:noProof/>
+              </w:rPr>
+              <w:fldChar w:fldCharType="begin"/>
+            </w:r>
+            <w:r>
+              <w:rPr>
+                <w:noProof/>
+              </w:rPr>
+              <w:instrText xml:space="preserve"> PAGEREF _Toc242520264 \h </w:instrText>
+            </w:r>
+            <w:r>
+              <w:rPr>
+                <w:noProof/>
+              </w:rPr>
+            </w:r>
+            <w:r>
+              <w:rPr>
+                <w:noProof/>
+              </w:rPr>
+              <w:fldChar w:fldCharType="separate"/>
+            </w:r>
+            <w:r>
+              <w:rPr>
+                <w:noProof/>
+              </w:rPr>
+              <w:t>6</w:t>
             </w:r>
             <w:r>
               <w:rPr>
@@ -600,7 +661,7 @@
               <w:noProof/>
             </w:rPr>
           </w:pPr>
-          <w:hyperlink w:anchor="_Toc242517538" w:history="1">
+          <w:hyperlink w:anchor="_Toc242520265" w:history="1">
             <w:r>
               <w:rPr>
                 <w:rStyle w:val="Hipervnculo"/>
@@ -624,7 +685,7 @@
               <w:rPr>
                 <w:noProof/>
               </w:rPr>
-              <w:instrText xml:space="preserve"> PAGEREF _Toc242517538 \h </w:instrText>
+              <w:instrText xml:space="preserve"> PAGEREF _Toc242520265 \h </w:instrText>
             </w:r>
             <w:r>
               <w:rPr>
@@ -641,7 +702,7 @@
               <w:rPr>
                 <w:noProof/>
               </w:rPr>
-              <w:t>5</w:t>
+              <w:t>6</w:t>
             </w:r>
             <w:r>
               <w:rPr>
@@ -661,7 +722,7 @@
               <w:noProof/>
             </w:rPr>
           </w:pPr>
-          <w:hyperlink w:anchor="_Toc242517539" w:history="1">
+          <w:hyperlink w:anchor="_Toc242520266" w:history="1">
             <w:r>
               <w:rPr>
                 <w:rStyle w:val="Hipervnculo"/>
@@ -685,7 +746,7 @@
               <w:rPr>
                 <w:noProof/>
               </w:rPr>
-              <w:instrText xml:space="preserve"> PAGEREF _Toc242517539 \h </w:instrText>
+              <w:instrText xml:space="preserve"> PAGEREF _Toc242520266 \h </w:instrText>
             </w:r>
             <w:r>
               <w:rPr>
@@ -702,7 +763,7 @@
               <w:rPr>
                 <w:noProof/>
               </w:rPr>
-              <w:t>5</w:t>
+              <w:t>6</w:t>
             </w:r>
             <w:r>
               <w:rPr>
@@ -722,7 +783,7 @@
               <w:noProof/>
             </w:rPr>
           </w:pPr>
-          <w:hyperlink w:anchor="_Toc242517540" w:history="1">
+          <w:hyperlink w:anchor="_Toc242520267" w:history="1">
             <w:r>
               <w:rPr>
                 <w:rStyle w:val="Hipervnculo"/>
@@ -746,7 +807,7 @@
               <w:rPr>
                 <w:noProof/>
               </w:rPr>
-              <w:instrText xml:space="preserve"> PAGEREF _Toc242517540 \h </w:instrText>
+              <w:instrText xml:space="preserve"> PAGEREF _Toc242520267 \h </w:instrText>
             </w:r>
             <w:r>
               <w:rPr>
@@ -763,7 +824,7 @@
               <w:rPr>
                 <w:noProof/>
               </w:rPr>
-              <w:t>6</w:t>
+              <w:t>7</w:t>
             </w:r>
             <w:r>
               <w:rPr>
@@ -783,7 +844,7 @@
               <w:noProof/>
             </w:rPr>
           </w:pPr>
-          <w:hyperlink w:anchor="_Toc242517541" w:history="1">
+          <w:hyperlink w:anchor="_Toc242520268" w:history="1">
             <w:r>
               <w:rPr>
                 <w:rStyle w:val="Hipervnculo"/>
@@ -807,7 +868,7 @@
               <w:rPr>
                 <w:noProof/>
               </w:rPr>
-              <w:instrText xml:space="preserve"> PAGEREF _Toc242517541 \h </w:instrText>
+              <w:instrText xml:space="preserve"> PAGEREF _Toc242520268 \h </w:instrText>
             </w:r>
             <w:r>
               <w:rPr>
@@ -824,7 +885,7 @@
               <w:rPr>
                 <w:noProof/>
               </w:rPr>
-              <w:t>7</w:t>
+              <w:t>8</w:t>
             </w:r>
             <w:r>
               <w:rPr>
@@ -844,7 +905,7 @@
               <w:noProof/>
             </w:rPr>
           </w:pPr>
-          <w:hyperlink w:anchor="_Toc242517542" w:history="1">
+          <w:hyperlink w:anchor="_Toc242520269" w:history="1">
             <w:r>
               <w:rPr>
                 <w:rStyle w:val="Hipervnculo"/>
@@ -868,7 +929,7 @@
               <w:rPr>
                 <w:noProof/>
               </w:rPr>
-              <w:instrText xml:space="preserve"> PAGEREF _Toc242517542 \h </w:instrText>
+              <w:instrText xml:space="preserve"> PAGEREF _Toc242520269 \h </w:instrText>
             </w:r>
             <w:r>
               <w:rPr>
@@ -885,7 +946,7 @@
               <w:rPr>
                 <w:noProof/>
               </w:rPr>
-              <w:t>7</w:t>
+              <w:t>8</w:t>
             </w:r>
             <w:r>
               <w:rPr>
@@ -905,7 +966,7 @@
               <w:noProof/>
             </w:rPr>
           </w:pPr>
-          <w:hyperlink w:anchor="_Toc242517543" w:history="1">
+          <w:hyperlink w:anchor="_Toc242520270" w:history="1">
             <w:r>
               <w:rPr>
                 <w:rStyle w:val="Hipervnculo"/>
@@ -929,7 +990,7 @@
               <w:rPr>
                 <w:noProof/>
               </w:rPr>
-              <w:instrText xml:space="preserve"> PAGEREF _Toc242517543 \h </w:instrText>
+              <w:instrText xml:space="preserve"> PAGEREF _Toc242520270 \h </w:instrText>
             </w:r>
             <w:r>
               <w:rPr>
@@ -966,7 +1027,7 @@
               <w:noProof/>
             </w:rPr>
           </w:pPr>
-          <w:hyperlink w:anchor="_Toc242517544" w:history="1">
+          <w:hyperlink w:anchor="_Toc242520271" w:history="1">
             <w:r>
               <w:rPr>
                 <w:rStyle w:val="Hipervnculo"/>
@@ -990,7 +1051,7 @@
               <w:rPr>
                 <w:noProof/>
               </w:rPr>
-              <w:instrText xml:space="preserve"> PAGEREF _Toc242517544 \h </w:instrText>
+              <w:instrText xml:space="preserve"> PAGEREF _Toc242520271 \h </w:instrText>
             </w:r>
             <w:r>
               <w:rPr>
@@ -1027,7 +1088,7 @@
               <w:noProof/>
             </w:rPr>
           </w:pPr>
-          <w:hyperlink w:anchor="_Toc242517545" w:history="1">
+          <w:hyperlink w:anchor="_Toc242520272" w:history="1">
             <w:r>
               <w:rPr>
                 <w:rStyle w:val="Hipervnculo"/>
@@ -1051,7 +1112,7 @@
               <w:rPr>
                 <w:noProof/>
               </w:rPr>
-              <w:instrText xml:space="preserve"> PAGEREF _Toc242517545 \h </w:instrText>
+              <w:instrText xml:space="preserve"> PAGEREF _Toc242520272 \h </w:instrText>
             </w:r>
             <w:r>
               <w:rPr>
@@ -1088,7 +1149,7 @@
               <w:noProof/>
             </w:rPr>
           </w:pPr>
-          <w:hyperlink w:anchor="_Toc242517546" w:history="1">
+          <w:hyperlink w:anchor="_Toc242520273" w:history="1">
             <w:r>
               <w:rPr>
                 <w:rStyle w:val="Hipervnculo"/>
@@ -1112,7 +1173,7 @@
               <w:rPr>
                 <w:noProof/>
               </w:rPr>
-              <w:instrText xml:space="preserve"> PAGEREF _Toc242517546 \h </w:instrText>
+              <w:instrText xml:space="preserve"> PAGEREF _Toc242520273 \h </w:instrText>
             </w:r>
             <w:r>
               <w:rPr>
@@ -1129,7 +1190,7 @@
               <w:rPr>
                 <w:noProof/>
               </w:rPr>
-              <w:t>9</w:t>
+              <w:t>10</w:t>
             </w:r>
             <w:r>
               <w:rPr>
@@ -1149,7 +1210,7 @@
               <w:noProof/>
             </w:rPr>
           </w:pPr>
-          <w:hyperlink w:anchor="_Toc242517547" w:history="1">
+          <w:hyperlink w:anchor="_Toc242520274" w:history="1">
             <w:r>
               <w:rPr>
                 <w:rStyle w:val="Hipervnculo"/>
@@ -1173,7 +1234,7 @@
               <w:rPr>
                 <w:noProof/>
               </w:rPr>
-              <w:instrText xml:space="preserve"> PAGEREF _Toc242517547 \h </w:instrText>
+              <w:instrText xml:space="preserve"> PAGEREF _Toc242520274 \h </w:instrText>
             </w:r>
             <w:r>
               <w:rPr>
@@ -1210,7 +1271,7 @@
               <w:noProof/>
             </w:rPr>
           </w:pPr>
-          <w:hyperlink w:anchor="_Toc242517548" w:history="1">
+          <w:hyperlink w:anchor="_Toc242520275" w:history="1">
             <w:r>
               <w:rPr>
                 <w:rStyle w:val="Hipervnculo"/>
@@ -1234,7 +1295,7 @@
               <w:rPr>
                 <w:noProof/>
               </w:rPr>
-              <w:instrText xml:space="preserve"> PAGEREF _Toc242517548 \h </w:instrText>
+              <w:instrText xml:space="preserve"> PAGEREF _Toc242520275 \h </w:instrText>
             </w:r>
             <w:r>
               <w:rPr>
@@ -1251,7 +1312,7 @@
               <w:rPr>
                 <w:noProof/>
               </w:rPr>
-              <w:t>10</w:t>
+              <w:t>11</w:t>
             </w:r>
             <w:r>
               <w:rPr>
@@ -1271,7 +1332,7 @@
               <w:noProof/>
             </w:rPr>
           </w:pPr>
-          <w:hyperlink w:anchor="_Toc242517549" w:history="1">
+          <w:hyperlink w:anchor="_Toc242520276" w:history="1">
             <w:r>
               <w:rPr>
                 <w:rStyle w:val="Hipervnculo"/>
@@ -1295,7 +1356,7 @@
               <w:rPr>
                 <w:noProof/>
               </w:rPr>
-              <w:instrText xml:space="preserve"> PAGEREF _Toc242517549 \h </w:instrText>
+              <w:instrText xml:space="preserve"> PAGEREF _Toc242520276 \h </w:instrText>
             </w:r>
             <w:r>
               <w:rPr>
@@ -1332,7 +1393,7 @@
               <w:noProof/>
             </w:rPr>
           </w:pPr>
-          <w:hyperlink w:anchor="_Toc242517550" w:history="1">
+          <w:hyperlink w:anchor="_Toc242520277" w:history="1">
             <w:r>
               <w:rPr>
                 <w:rStyle w:val="Hipervnculo"/>
@@ -1356,7 +1417,7 @@
               <w:rPr>
                 <w:noProof/>
               </w:rPr>
-              <w:instrText xml:space="preserve"> PAGEREF _Toc242517550 \h </w:instrText>
+              <w:instrText xml:space="preserve"> PAGEREF _Toc242520277 \h </w:instrText>
             </w:r>
             <w:r>
               <w:rPr>
@@ -1393,7 +1454,7 @@
               <w:noProof/>
             </w:rPr>
           </w:pPr>
-          <w:hyperlink w:anchor="_Toc242517551" w:history="1">
+          <w:hyperlink w:anchor="_Toc242520278" w:history="1">
             <w:r>
               <w:rPr>
                 <w:rStyle w:val="Hipervnculo"/>
@@ -1417,7 +1478,7 @@
               <w:rPr>
                 <w:noProof/>
               </w:rPr>
-              <w:instrText xml:space="preserve"> PAGEREF _Toc242517551 \h </w:instrText>
+              <w:instrText xml:space="preserve"> PAGEREF _Toc242520278 \h </w:instrText>
             </w:r>
             <w:r>
               <w:rPr>
@@ -1434,7 +1495,7 @@
               <w:rPr>
                 <w:noProof/>
               </w:rPr>
-              <w:t>11</w:t>
+              <w:t>12</w:t>
             </w:r>
             <w:r>
               <w:rPr>
@@ -1454,7 +1515,7 @@
               <w:noProof/>
             </w:rPr>
           </w:pPr>
-          <w:hyperlink w:anchor="_Toc242517552" w:history="1">
+          <w:hyperlink w:anchor="_Toc242520279" w:history="1">
             <w:r>
               <w:rPr>
                 <w:rStyle w:val="Hipervnculo"/>
@@ -1478,7 +1539,7 @@
               <w:rPr>
                 <w:noProof/>
               </w:rPr>
-              <w:instrText xml:space="preserve"> PAGEREF _Toc242517552 \h </w:instrText>
+              <w:instrText xml:space="preserve"> PAGEREF _Toc242520279 \h </w:instrText>
             </w:r>
             <w:r>
               <w:rPr>
@@ -1515,7 +1576,7 @@
               <w:noProof/>
             </w:rPr>
           </w:pPr>
-          <w:hyperlink w:anchor="_Toc242517553" w:history="1">
+          <w:hyperlink w:anchor="_Toc242520280" w:history="1">
             <w:r>
               <w:rPr>
                 <w:rStyle w:val="Hipervnculo"/>
@@ -1539,7 +1600,7 @@
               <w:rPr>
                 <w:noProof/>
               </w:rPr>
-              <w:instrText xml:space="preserve"> PAGEREF _Toc242517553 \h </w:instrText>
+              <w:instrText xml:space="preserve"> PAGEREF _Toc242520280 \h </w:instrText>
             </w:r>
             <w:r>
               <w:rPr>
@@ -1556,7 +1617,7 @@
               <w:rPr>
                 <w:noProof/>
               </w:rPr>
-              <w:t>12</w:t>
+              <w:t>13</w:t>
             </w:r>
             <w:r>
               <w:rPr>
@@ -1584,7 +1645,17 @@
       </w:pPr>
       <w:r>
         <w:lastRenderedPageBreak/>
-        <w:t xml:space="preserve">Este manual está dirigido al equipo que audita el proyecto. Explica cómo provocar cada escenario de energía, ambiente, acceso físico y red, qué debe registrar la plataforma, contra qué norma se evalúa y cómo comprobar la evidencia. No cubre el uso básico del tablero ni el encendido del laboratorio; para eso están </w:t>
+        <w:t xml:space="preserve">Este manual está dirigido al equipo que audita el proyecto. Explica cómo provocar cada escenario de energía, ambiente, acceso físico y red, qué debe registrar la plataforma, contra qué norma se evalúa y cómo comprobar la evidencia. Esta versión corresponde a la </w:t>
+      </w:r>
+      <w:r>
+        <w:rPr>
+          <w:b/>
+          <w:bCs/>
+        </w:rPr>
+        <w:t>ejecución local</w:t>
+      </w:r>
+      <w:r>
+        <w:t xml:space="preserve"> del laboratorio (sección 3.1); el detalle de instalación y solución de problemas está en </w:t>
       </w:r>
       <w:r>
         <w:rPr>
@@ -1608,86 +1679,6 @@
         <w:t>DESPLIEGUE_GNS3.md</w:t>
       </w:r>
       <w:r>
-        <w:t xml:space="preserve">. Cómo entrar al laboratorio en la nube: </w:t>
-      </w:r>
-      <w:r>
-        <w:rPr>
-          <w:rFonts w:ascii="Consolas" w:eastAsia="Consolas" w:hAnsi="Consolas" w:cs="Consolas"/>
-          <w:color w:val="7B2C2C"/>
-          <w:sz w:val="19"/>
-          <w:szCs w:val="19"/>
-        </w:rPr>
-        <w:t>ACCESO_AUDITORES.md</w:t>
-      </w:r>
-      <w:r>
-        <w:t>.</w:t>
-      </w:r>
-    </w:p>
-    <w:p>
-      <w:pPr>
-        <w:spacing w:after="120"/>
-      </w:pPr>
-      <w:r>
-        <w:t xml:space="preserve">En la nube, la plataforma está en </w:t>
-      </w:r>
-      <w:r>
-        <w:rPr>
-          <w:rFonts w:ascii="Consolas" w:eastAsia="Consolas" w:hAnsi="Consolas" w:cs="Consolas"/>
-          <w:color w:val="7B2C2C"/>
-          <w:sz w:val="19"/>
-          <w:szCs w:val="19"/>
-        </w:rPr>
-        <w:t>https://dcim.&lt;tailnet&gt;.ts.net</w:t>
-      </w:r>
-      <w:r>
-        <w:t xml:space="preserve"> y el punto de captura es </w:t>
-      </w:r>
-      <w:r>
-        <w:rPr>
-          <w:rFonts w:ascii="Consolas" w:eastAsia="Consolas" w:hAnsi="Consolas" w:cs="Consolas"/>
-          <w:color w:val="7B2C2C"/>
-          <w:sz w:val="19"/>
-          <w:szCs w:val="19"/>
-        </w:rPr>
-        <w:t>br-lab</w:t>
-      </w:r>
-      <w:r>
-        <w:t xml:space="preserve"> en lugar de </w:t>
-      </w:r>
-      <w:r>
-        <w:rPr>
-          <w:rFonts w:ascii="Consolas" w:eastAsia="Consolas" w:hAnsi="Consolas" w:cs="Consolas"/>
-          <w:color w:val="7B2C2C"/>
-          <w:sz w:val="19"/>
-          <w:szCs w:val="19"/>
-        </w:rPr>
-        <w:t>eth2</w:t>
-      </w:r>
-      <w:r>
-        <w:t xml:space="preserve">. Los comandos </w:t>
-      </w:r>
-      <w:r>
-        <w:rPr>
-          <w:rFonts w:ascii="Consolas" w:eastAsia="Consolas" w:hAnsi="Consolas" w:cs="Consolas"/>
-          <w:color w:val="7B2C2C"/>
-          <w:sz w:val="19"/>
-          <w:szCs w:val="19"/>
-        </w:rPr>
-        <w:t>evidencia.ps1</w:t>
-      </w:r>
-      <w:r>
-        <w:t xml:space="preserve"> llevan </w:t>
-      </w:r>
-      <w:r>
-        <w:rPr>
-          <w:rFonts w:ascii="Consolas" w:eastAsia="Consolas" w:hAnsi="Consolas" w:cs="Consolas"/>
-          <w:color w:val="7B2C2C"/>
-          <w:sz w:val="19"/>
-          <w:szCs w:val="19"/>
-        </w:rPr>
-        <w:t>-VM gns3@dcim</w:t>
-      </w:r>
-      <w:r>
         <w:t>.</w:t>
       </w:r>
     </w:p>
@@ -1696,7 +1687,7 @@
         <w:pStyle w:val="Ttulo1"/>
         <w:keepNext/>
       </w:pPr>
-      <w:bookmarkStart w:id="0" w:name="_Toc242517532"/>
+      <w:bookmarkStart w:id="0" w:name="_Toc242520258"/>
       <w:r>
         <w:t>1. Alcance y carácter simulado</w:t>
       </w:r>
@@ -2366,7 +2357,7 @@
         <w:pStyle w:val="Ttulo1"/>
         <w:keepNext/>
       </w:pPr>
-      <w:bookmarkStart w:id="1" w:name="_Toc242517533"/>
+      <w:bookmarkStart w:id="1" w:name="_Toc242520259"/>
       <w:r>
         <w:t>2. Marco normativo aplicado</w:t>
       </w:r>
@@ -2891,7 +2882,6 @@
                 <w:sz w:val="19"/>
                 <w:szCs w:val="19"/>
               </w:rPr>
-              <w:lastRenderedPageBreak/>
               <w:t>IEEE 1188</w:t>
             </w:r>
           </w:p>
@@ -3004,6 +2994,7 @@
                 <w:sz w:val="19"/>
                 <w:szCs w:val="19"/>
               </w:rPr>
+              <w:lastRenderedPageBreak/>
               <w:t>ISO 22301</w:t>
             </w:r>
           </w:p>
@@ -4252,7 +4243,7 @@
         <w:pStyle w:val="Ttulo1"/>
         <w:keepNext/>
       </w:pPr>
-      <w:bookmarkStart w:id="2" w:name="_Toc242517534"/>
+      <w:bookmarkStart w:id="2" w:name="_Toc242520260"/>
       <w:r>
         <w:t>3. Preparación para auditar</w:t>
       </w:r>
@@ -4263,11 +4254,793 @@
         <w:pStyle w:val="Ttulo2"/>
         <w:keepNext/>
       </w:pPr>
-      <w:bookmarkStart w:id="3" w:name="_Toc242517535"/>
+      <w:bookmarkStart w:id="3" w:name="_Toc242520261"/>
       <w:r>
-        <w:t>3.1 Cuentas necesarias</w:t>
+        <w:t>3.1 Ejecución local</w:t>
       </w:r>
       <w:bookmarkEnd w:id="3"/>
+    </w:p>
+    <w:tbl>
+      <w:tblPr>
+        <w:tblW w:w="10080" w:type="dxa"/>
+        <w:tblBorders>
+          <w:top w:val="single" w:sz="4" w:space="0" w:color="auto"/>
+          <w:left w:val="single" w:sz="4" w:space="0" w:color="auto"/>
+          <w:bottom w:val="single" w:sz="4" w:space="0" w:color="auto"/>
+          <w:right w:val="single" w:sz="4" w:space="0" w:color="auto"/>
+          <w:insideH w:val="single" w:sz="4" w:space="0" w:color="auto"/>
+          <w:insideV w:val="single" w:sz="4" w:space="0" w:color="auto"/>
+        </w:tblBorders>
+        <w:tblLook w:val="04A0" w:firstRow="1" w:lastRow="0" w:firstColumn="1" w:lastColumn="0" w:noHBand="0" w:noVBand="1"/>
+      </w:tblPr>
+      <w:tblGrid>
+        <w:gridCol w:w="2151"/>
+        <w:gridCol w:w="7929"/>
+      </w:tblGrid>
+      <w:tr>
+        <w:trPr>
+          <w:cantSplit/>
+          <w:tblHeader/>
+        </w:trPr>
+        <w:tc>
+          <w:tcPr>
+            <w:tcW w:w="2151" w:type="dxa"/>
+            <w:tcBorders>
+              <w:top w:val="single" w:sz="4" w:space="0" w:color="A6A6A6"/>
+              <w:left w:val="single" w:sz="4" w:space="0" w:color="A6A6A6"/>
+              <w:bottom w:val="single" w:sz="4" w:space="0" w:color="A6A6A6"/>
+              <w:right w:val="single" w:sz="4" w:space="0" w:color="A6A6A6"/>
+            </w:tcBorders>
+            <w:shd w:val="clear" w:color="auto" w:fill="1F3864"/>
+            <w:tcMar>
+              <w:top w:w="60" w:type="dxa"/>
+              <w:left w:w="100" w:type="dxa"/>
+              <w:bottom w:w="60" w:type="dxa"/>
+              <w:right w:w="100" w:type="dxa"/>
+            </w:tcMar>
+          </w:tcPr>
+          <w:p>
+            <w:r>
+              <w:rPr>
+                <w:b/>
+                <w:bCs/>
+                <w:color w:val="FFFFFF"/>
+                <w:sz w:val="19"/>
+                <w:szCs w:val="19"/>
+              </w:rPr>
+              <w:t>Elemento</w:t>
+            </w:r>
+          </w:p>
+        </w:tc>
+        <w:tc>
+          <w:tcPr>
+            <w:tcW w:w="7929" w:type="dxa"/>
+            <w:tcBorders>
+              <w:top w:val="single" w:sz="4" w:space="0" w:color="A6A6A6"/>
+              <w:left w:val="single" w:sz="4" w:space="0" w:color="A6A6A6"/>
+              <w:bottom w:val="single" w:sz="4" w:space="0" w:color="A6A6A6"/>
+              <w:right w:val="single" w:sz="4" w:space="0" w:color="A6A6A6"/>
+            </w:tcBorders>
+            <w:shd w:val="clear" w:color="auto" w:fill="1F3864"/>
+            <w:tcMar>
+              <w:top w:w="60" w:type="dxa"/>
+              <w:left w:w="100" w:type="dxa"/>
+              <w:bottom w:w="60" w:type="dxa"/>
+              <w:right w:w="100" w:type="dxa"/>
+            </w:tcMar>
+          </w:tcPr>
+          <w:p>
+            <w:r>
+              <w:rPr>
+                <w:b/>
+                <w:bCs/>
+                <w:color w:val="FFFFFF"/>
+                <w:sz w:val="19"/>
+                <w:szCs w:val="19"/>
+              </w:rPr>
+              <w:t>Valor</w:t>
+            </w:r>
+          </w:p>
+        </w:tc>
+      </w:tr>
+      <w:tr>
+        <w:trPr>
+          <w:cantSplit/>
+        </w:trPr>
+        <w:tc>
+          <w:tcPr>
+            <w:tcW w:w="2151" w:type="dxa"/>
+            <w:tcBorders>
+              <w:top w:val="single" w:sz="4" w:space="0" w:color="A6A6A6"/>
+              <w:left w:val="single" w:sz="4" w:space="0" w:color="A6A6A6"/>
+              <w:bottom w:val="single" w:sz="4" w:space="0" w:color="A6A6A6"/>
+              <w:right w:val="single" w:sz="4" w:space="0" w:color="A6A6A6"/>
+            </w:tcBorders>
+            <w:tcMar>
+              <w:top w:w="60" w:type="dxa"/>
+              <w:left w:w="100" w:type="dxa"/>
+              <w:bottom w:w="60" w:type="dxa"/>
+              <w:right w:w="100" w:type="dxa"/>
+            </w:tcMar>
+          </w:tcPr>
+          <w:p>
+            <w:r>
+              <w:rPr>
+                <w:sz w:val="19"/>
+                <w:szCs w:val="19"/>
+              </w:rPr>
+              <w:t>Equipo anfitrión</w:t>
+            </w:r>
+          </w:p>
+        </w:tc>
+        <w:tc>
+          <w:tcPr>
+            <w:tcW w:w="7929" w:type="dxa"/>
+            <w:tcBorders>
+              <w:top w:val="single" w:sz="4" w:space="0" w:color="A6A6A6"/>
+              <w:left w:val="single" w:sz="4" w:space="0" w:color="A6A6A6"/>
+              <w:bottom w:val="single" w:sz="4" w:space="0" w:color="A6A6A6"/>
+              <w:right w:val="single" w:sz="4" w:space="0" w:color="A6A6A6"/>
+            </w:tcBorders>
+            <w:tcMar>
+              <w:top w:w="60" w:type="dxa"/>
+              <w:left w:w="100" w:type="dxa"/>
+              <w:bottom w:w="60" w:type="dxa"/>
+              <w:right w:w="100" w:type="dxa"/>
+            </w:tcMar>
+          </w:tcPr>
+          <w:p>
+            <w:r>
+              <w:rPr>
+                <w:sz w:val="19"/>
+                <w:szCs w:val="19"/>
+              </w:rPr>
+              <w:t>Windows con GNS3 2.2.61, VirtualBox y la GNS3 VM</w:t>
+            </w:r>
+          </w:p>
+        </w:tc>
+      </w:tr>
+      <w:tr>
+        <w:trPr>
+          <w:cantSplit/>
+        </w:trPr>
+        <w:tc>
+          <w:tcPr>
+            <w:tcW w:w="2151" w:type="dxa"/>
+            <w:tcBorders>
+              <w:top w:val="single" w:sz="4" w:space="0" w:color="A6A6A6"/>
+              <w:left w:val="single" w:sz="4" w:space="0" w:color="A6A6A6"/>
+              <w:bottom w:val="single" w:sz="4" w:space="0" w:color="A6A6A6"/>
+              <w:right w:val="single" w:sz="4" w:space="0" w:color="A6A6A6"/>
+            </w:tcBorders>
+            <w:shd w:val="clear" w:color="auto" w:fill="F7F9FC"/>
+            <w:tcMar>
+              <w:top w:w="60" w:type="dxa"/>
+              <w:left w:w="100" w:type="dxa"/>
+              <w:bottom w:w="60" w:type="dxa"/>
+              <w:right w:w="100" w:type="dxa"/>
+            </w:tcMar>
+          </w:tcPr>
+          <w:p>
+            <w:r>
+              <w:rPr>
+                <w:sz w:val="19"/>
+                <w:szCs w:val="19"/>
+              </w:rPr>
+              <w:t>GNS3 VM</w:t>
+            </w:r>
+          </w:p>
+        </w:tc>
+        <w:tc>
+          <w:tcPr>
+            <w:tcW w:w="7929" w:type="dxa"/>
+            <w:tcBorders>
+              <w:top w:val="single" w:sz="4" w:space="0" w:color="A6A6A6"/>
+              <w:left w:val="single" w:sz="4" w:space="0" w:color="A6A6A6"/>
+              <w:bottom w:val="single" w:sz="4" w:space="0" w:color="A6A6A6"/>
+              <w:right w:val="single" w:sz="4" w:space="0" w:color="A6A6A6"/>
+            </w:tcBorders>
+            <w:shd w:val="clear" w:color="auto" w:fill="F7F9FC"/>
+            <w:tcMar>
+              <w:top w:w="60" w:type="dxa"/>
+              <w:left w:w="100" w:type="dxa"/>
+              <w:bottom w:w="60" w:type="dxa"/>
+              <w:right w:w="100" w:type="dxa"/>
+            </w:tcMar>
+          </w:tcPr>
+          <w:p>
+            <w:r>
+              <w:rPr>
+                <w:rFonts w:ascii="Consolas" w:eastAsia="Consolas" w:hAnsi="Consolas" w:cs="Consolas"/>
+                <w:color w:val="7B2C2C"/>
+                <w:sz w:val="17"/>
+                <w:szCs w:val="17"/>
+              </w:rPr>
+              <w:t>192.168.56.101</w:t>
+            </w:r>
+            <w:r>
+              <w:rPr>
+                <w:sz w:val="19"/>
+                <w:szCs w:val="19"/>
+              </w:rPr>
+              <w:t xml:space="preserve">, usuario </w:t>
+            </w:r>
+            <w:r>
+              <w:rPr>
+                <w:rFonts w:ascii="Consolas" w:eastAsia="Consolas" w:hAnsi="Consolas" w:cs="Consolas"/>
+                <w:color w:val="7B2C2C"/>
+                <w:sz w:val="17"/>
+                <w:szCs w:val="17"/>
+              </w:rPr>
+              <w:t>gns3</w:t>
+            </w:r>
+            <w:r>
+              <w:rPr>
+                <w:sz w:val="19"/>
+                <w:szCs w:val="19"/>
+              </w:rPr>
+              <w:t>, acceso por llave SSH</w:t>
+            </w:r>
+          </w:p>
+        </w:tc>
+      </w:tr>
+      <w:tr>
+        <w:trPr>
+          <w:cantSplit/>
+        </w:trPr>
+        <w:tc>
+          <w:tcPr>
+            <w:tcW w:w="2151" w:type="dxa"/>
+            <w:tcBorders>
+              <w:top w:val="single" w:sz="4" w:space="0" w:color="A6A6A6"/>
+              <w:left w:val="single" w:sz="4" w:space="0" w:color="A6A6A6"/>
+              <w:bottom w:val="single" w:sz="4" w:space="0" w:color="A6A6A6"/>
+              <w:right w:val="single" w:sz="4" w:space="0" w:color="A6A6A6"/>
+            </w:tcBorders>
+            <w:tcMar>
+              <w:top w:w="60" w:type="dxa"/>
+              <w:left w:w="100" w:type="dxa"/>
+              <w:bottom w:w="60" w:type="dxa"/>
+              <w:right w:w="100" w:type="dxa"/>
+            </w:tcMar>
+          </w:tcPr>
+          <w:p>
+            <w:r>
+              <w:rPr>
+                <w:sz w:val="19"/>
+                <w:szCs w:val="19"/>
+              </w:rPr>
+              <w:t>Red del laboratorio</w:t>
+            </w:r>
+          </w:p>
+        </w:tc>
+        <w:tc>
+          <w:tcPr>
+            <w:tcW w:w="7929" w:type="dxa"/>
+            <w:tcBorders>
+              <w:top w:val="single" w:sz="4" w:space="0" w:color="A6A6A6"/>
+              <w:left w:val="single" w:sz="4" w:space="0" w:color="A6A6A6"/>
+              <w:bottom w:val="single" w:sz="4" w:space="0" w:color="A6A6A6"/>
+              <w:right w:val="single" w:sz="4" w:space="0" w:color="A6A6A6"/>
+            </w:tcBorders>
+            <w:tcMar>
+              <w:top w:w="60" w:type="dxa"/>
+              <w:left w:w="100" w:type="dxa"/>
+              <w:bottom w:w="60" w:type="dxa"/>
+              <w:right w:w="100" w:type="dxa"/>
+            </w:tcMar>
+          </w:tcPr>
+          <w:p>
+            <w:r>
+              <w:rPr>
+                <w:rFonts w:ascii="Consolas" w:eastAsia="Consolas" w:hAnsi="Consolas" w:cs="Consolas"/>
+                <w:color w:val="7B2C2C"/>
+                <w:sz w:val="17"/>
+                <w:szCs w:val="17"/>
+              </w:rPr>
+              <w:t>10.10.10.0/24</w:t>
+            </w:r>
+            <w:r>
+              <w:rPr>
+                <w:sz w:val="19"/>
+                <w:szCs w:val="19"/>
+              </w:rPr>
+              <w:t xml:space="preserve">; la VM captura en </w:t>
+            </w:r>
+            <w:r>
+              <w:rPr>
+                <w:rFonts w:ascii="Consolas" w:eastAsia="Consolas" w:hAnsi="Consolas" w:cs="Consolas"/>
+                <w:color w:val="7B2C2C"/>
+                <w:sz w:val="17"/>
+                <w:szCs w:val="17"/>
+              </w:rPr>
+              <w:t>eth2</w:t>
+            </w:r>
+            <w:r>
+              <w:rPr>
+                <w:sz w:val="19"/>
+                <w:szCs w:val="19"/>
+              </w:rPr>
+              <w:t xml:space="preserve"> (10.10.10.1), conectada al nodo Cloud1</w:t>
+            </w:r>
+          </w:p>
+        </w:tc>
+      </w:tr>
+      <w:tr>
+        <w:trPr>
+          <w:cantSplit/>
+        </w:trPr>
+        <w:tc>
+          <w:tcPr>
+            <w:tcW w:w="2151" w:type="dxa"/>
+            <w:tcBorders>
+              <w:top w:val="single" w:sz="4" w:space="0" w:color="A6A6A6"/>
+              <w:left w:val="single" w:sz="4" w:space="0" w:color="A6A6A6"/>
+              <w:bottom w:val="single" w:sz="4" w:space="0" w:color="A6A6A6"/>
+              <w:right w:val="single" w:sz="4" w:space="0" w:color="A6A6A6"/>
+            </w:tcBorders>
+            <w:shd w:val="clear" w:color="auto" w:fill="F7F9FC"/>
+            <w:tcMar>
+              <w:top w:w="60" w:type="dxa"/>
+              <w:left w:w="100" w:type="dxa"/>
+              <w:bottom w:w="60" w:type="dxa"/>
+              <w:right w:w="100" w:type="dxa"/>
+            </w:tcMar>
+          </w:tcPr>
+          <w:p>
+            <w:r>
+              <w:rPr>
+                <w:sz w:val="19"/>
+                <w:szCs w:val="19"/>
+              </w:rPr>
+              <w:t>Plataforma</w:t>
+            </w:r>
+          </w:p>
+        </w:tc>
+        <w:tc>
+          <w:tcPr>
+            <w:tcW w:w="7929" w:type="dxa"/>
+            <w:tcBorders>
+              <w:top w:val="single" w:sz="4" w:space="0" w:color="A6A6A6"/>
+              <w:left w:val="single" w:sz="4" w:space="0" w:color="A6A6A6"/>
+              <w:bottom w:val="single" w:sz="4" w:space="0" w:color="A6A6A6"/>
+              <w:right w:val="single" w:sz="4" w:space="0" w:color="A6A6A6"/>
+            </w:tcBorders>
+            <w:shd w:val="clear" w:color="auto" w:fill="F7F9FC"/>
+            <w:tcMar>
+              <w:top w:w="60" w:type="dxa"/>
+              <w:left w:w="100" w:type="dxa"/>
+              <w:bottom w:w="60" w:type="dxa"/>
+              <w:right w:w="100" w:type="dxa"/>
+            </w:tcMar>
+          </w:tcPr>
+          <w:p>
+            <w:r>
+              <w:rPr>
+                <w:sz w:val="19"/>
+                <w:szCs w:val="19"/>
+              </w:rPr>
+              <w:t xml:space="preserve">Seis contenedores Docker dentro de la VM, publicados solo en </w:t>
+            </w:r>
+            <w:r>
+              <w:rPr>
+                <w:rFonts w:ascii="Consolas" w:eastAsia="Consolas" w:hAnsi="Consolas" w:cs="Consolas"/>
+                <w:color w:val="7B2C2C"/>
+                <w:sz w:val="17"/>
+                <w:szCs w:val="17"/>
+              </w:rPr>
+              <w:t>127.0.0.1:8000</w:t>
+            </w:r>
+            <w:r>
+              <w:rPr>
+                <w:sz w:val="19"/>
+                <w:szCs w:val="19"/>
+              </w:rPr>
+              <w:t xml:space="preserve"> de la VM</w:t>
+            </w:r>
+          </w:p>
+        </w:tc>
+      </w:tr>
+      <w:tr>
+        <w:trPr>
+          <w:cantSplit/>
+        </w:trPr>
+        <w:tc>
+          <w:tcPr>
+            <w:tcW w:w="2151" w:type="dxa"/>
+            <w:tcBorders>
+              <w:top w:val="single" w:sz="4" w:space="0" w:color="A6A6A6"/>
+              <w:left w:val="single" w:sz="4" w:space="0" w:color="A6A6A6"/>
+              <w:bottom w:val="single" w:sz="4" w:space="0" w:color="A6A6A6"/>
+              <w:right w:val="single" w:sz="4" w:space="0" w:color="A6A6A6"/>
+            </w:tcBorders>
+            <w:tcMar>
+              <w:top w:w="60" w:type="dxa"/>
+              <w:left w:w="100" w:type="dxa"/>
+              <w:bottom w:w="60" w:type="dxa"/>
+              <w:right w:w="100" w:type="dxa"/>
+            </w:tcMar>
+          </w:tcPr>
+          <w:p>
+            <w:r>
+              <w:rPr>
+                <w:sz w:val="19"/>
+                <w:szCs w:val="19"/>
+              </w:rPr>
+              <w:lastRenderedPageBreak/>
+              <w:t>Acceso</w:t>
+            </w:r>
+          </w:p>
+        </w:tc>
+        <w:tc>
+          <w:tcPr>
+            <w:tcW w:w="7929" w:type="dxa"/>
+            <w:tcBorders>
+              <w:top w:val="single" w:sz="4" w:space="0" w:color="A6A6A6"/>
+              <w:left w:val="single" w:sz="4" w:space="0" w:color="A6A6A6"/>
+              <w:bottom w:val="single" w:sz="4" w:space="0" w:color="A6A6A6"/>
+              <w:right w:val="single" w:sz="4" w:space="0" w:color="A6A6A6"/>
+            </w:tcBorders>
+            <w:tcMar>
+              <w:top w:w="60" w:type="dxa"/>
+              <w:left w:w="100" w:type="dxa"/>
+              <w:bottom w:w="60" w:type="dxa"/>
+              <w:right w:w="100" w:type="dxa"/>
+            </w:tcMar>
+          </w:tcPr>
+          <w:p>
+            <w:r>
+              <w:rPr>
+                <w:rFonts w:ascii="Consolas" w:eastAsia="Consolas" w:hAnsi="Consolas" w:cs="Consolas"/>
+                <w:color w:val="7B2C2C"/>
+                <w:sz w:val="17"/>
+                <w:szCs w:val="17"/>
+              </w:rPr>
+              <w:t>http://localhost:8000</w:t>
+            </w:r>
+            <w:r>
+              <w:rPr>
+                <w:sz w:val="19"/>
+                <w:szCs w:val="19"/>
+              </w:rPr>
+              <w:t xml:space="preserve"> desde Windows, a través de un túnel SSH</w:t>
+            </w:r>
+          </w:p>
+        </w:tc>
+      </w:tr>
+      <w:tr>
+        <w:trPr>
+          <w:cantSplit/>
+        </w:trPr>
+        <w:tc>
+          <w:tcPr>
+            <w:tcW w:w="2151" w:type="dxa"/>
+            <w:tcBorders>
+              <w:top w:val="single" w:sz="4" w:space="0" w:color="A6A6A6"/>
+              <w:left w:val="single" w:sz="4" w:space="0" w:color="A6A6A6"/>
+              <w:bottom w:val="single" w:sz="4" w:space="0" w:color="A6A6A6"/>
+              <w:right w:val="single" w:sz="4" w:space="0" w:color="A6A6A6"/>
+            </w:tcBorders>
+            <w:shd w:val="clear" w:color="auto" w:fill="F7F9FC"/>
+            <w:tcMar>
+              <w:top w:w="60" w:type="dxa"/>
+              <w:left w:w="100" w:type="dxa"/>
+              <w:bottom w:w="60" w:type="dxa"/>
+              <w:right w:w="100" w:type="dxa"/>
+            </w:tcMar>
+          </w:tcPr>
+          <w:p>
+            <w:r>
+              <w:rPr>
+                <w:sz w:val="19"/>
+                <w:szCs w:val="19"/>
+              </w:rPr>
+              <w:t>Navegador</w:t>
+            </w:r>
+          </w:p>
+        </w:tc>
+        <w:tc>
+          <w:tcPr>
+            <w:tcW w:w="7929" w:type="dxa"/>
+            <w:tcBorders>
+              <w:top w:val="single" w:sz="4" w:space="0" w:color="A6A6A6"/>
+              <w:left w:val="single" w:sz="4" w:space="0" w:color="A6A6A6"/>
+              <w:bottom w:val="single" w:sz="4" w:space="0" w:color="A6A6A6"/>
+              <w:right w:val="single" w:sz="4" w:space="0" w:color="A6A6A6"/>
+            </w:tcBorders>
+            <w:shd w:val="clear" w:color="auto" w:fill="F7F9FC"/>
+            <w:tcMar>
+              <w:top w:w="60" w:type="dxa"/>
+              <w:left w:w="100" w:type="dxa"/>
+              <w:bottom w:w="60" w:type="dxa"/>
+              <w:right w:w="100" w:type="dxa"/>
+            </w:tcMar>
+          </w:tcPr>
+          <w:p>
+            <w:r>
+              <w:rPr>
+                <w:sz w:val="19"/>
+                <w:szCs w:val="19"/>
+              </w:rPr>
+              <w:t>Chrome o Edge; un teléfono con Bluetooth para la passkey</w:t>
+            </w:r>
+          </w:p>
+        </w:tc>
+      </w:tr>
+    </w:tbl>
+    <w:p>
+      <w:pPr>
+        <w:spacing w:after="80"/>
+      </w:pPr>
+    </w:p>
+    <w:p>
+      <w:pPr>
+        <w:spacing w:after="120"/>
+      </w:pPr>
+      <w:r>
+        <w:t>Pasos, en este orden:</w:t>
+      </w:r>
+    </w:p>
+    <w:p>
+      <w:pPr>
+        <w:pStyle w:val="Prrafodelista"/>
+        <w:numPr>
+          <w:ilvl w:val="0"/>
+          <w:numId w:val="2"/>
+        </w:numPr>
+        <w:spacing w:after="60"/>
+      </w:pPr>
+      <w:r>
+        <w:t xml:space="preserve">Abrir GNS3 en Windows: arranca la GNS3 VM. Abrir el proyecto </w:t>
+      </w:r>
+      <w:r>
+        <w:rPr>
+          <w:b/>
+          <w:bCs/>
+        </w:rPr>
+        <w:t>Topologia</w:t>
+      </w:r>
+      <w:r>
+        <w:t xml:space="preserve"> y pulsar </w:t>
+      </w:r>
+      <w:r>
+        <w:rPr>
+          <w:i/>
+          <w:iCs/>
+        </w:rPr>
+        <w:t>Start all nodes</w:t>
+      </w:r>
+      <w:r>
+        <w:t xml:space="preserve">. Dejar </w:t>
+      </w:r>
+      <w:r>
+        <w:rPr>
+          <w:b/>
+          <w:bCs/>
+        </w:rPr>
+        <w:t>PC-INTRUSO apagado</w:t>
+      </w:r>
+      <w:r>
+        <w:t>: encenderlo es el escenario R1.</w:t>
+      </w:r>
+    </w:p>
+    <w:p>
+      <w:pPr>
+        <w:pStyle w:val="Prrafodelista"/>
+        <w:numPr>
+          <w:ilvl w:val="0"/>
+          <w:numId w:val="2"/>
+        </w:numPr>
+        <w:spacing w:after="60"/>
+      </w:pPr>
+      <w:r>
+        <w:t xml:space="preserve">Comprobar en </w:t>
+      </w:r>
+      <w:r>
+        <w:rPr>
+          <w:i/>
+          <w:iCs/>
+        </w:rPr>
+        <w:t>Topology Summary</w:t>
+      </w:r>
+      <w:r>
+        <w:t xml:space="preserve"> que Cloud1 está conectado por </w:t>
+      </w:r>
+      <w:r>
+        <w:rPr>
+          <w:rFonts w:ascii="Consolas" w:eastAsia="Consolas" w:hAnsi="Consolas" w:cs="Consolas"/>
+          <w:color w:val="7B2C2C"/>
+          <w:sz w:val="19"/>
+          <w:szCs w:val="19"/>
+        </w:rPr>
+        <w:t>eth2</w:t>
+      </w:r>
+      <w:r>
+        <w:t xml:space="preserve"> a SW-CIRC-A </w:t>
+      </w:r>
+      <w:r>
+        <w:rPr>
+          <w:rFonts w:ascii="Consolas" w:eastAsia="Consolas" w:hAnsi="Consolas" w:cs="Consolas"/>
+          <w:color w:val="7B2C2C"/>
+          <w:sz w:val="19"/>
+          <w:szCs w:val="19"/>
+        </w:rPr>
+        <w:t>eth4</w:t>
+      </w:r>
+      <w:r>
+        <w:t>. Cada Alpine levanta su IP y su latido al arrancar; no hay que configurar nada.</w:t>
+      </w:r>
+    </w:p>
+    <w:p>
+      <w:pPr>
+        <w:pStyle w:val="Prrafodelista"/>
+        <w:numPr>
+          <w:ilvl w:val="0"/>
+          <w:numId w:val="2"/>
+        </w:numPr>
+        <w:spacing w:after="60"/>
+      </w:pPr>
+      <w:r>
+        <w:t>La plataforma arranca sola con la VM. Para comprobarla, en PowerShell:</w:t>
+      </w:r>
+    </w:p>
+    <w:p>
+      <w:pPr>
+        <w:shd w:val="clear" w:color="auto" w:fill="F2F2F2"/>
+        <w:spacing w:before="80" w:after="160" w:line="240" w:lineRule="auto"/>
+        <w:ind w:left="200" w:right="200"/>
+      </w:pPr>
+      <w:r>
+        <w:rPr>
+          <w:rFonts w:ascii="Consolas" w:eastAsia="Consolas" w:hAnsi="Consolas" w:cs="Consolas"/>
+          <w:sz w:val="17"/>
+          <w:szCs w:val="17"/>
+        </w:rPr>
+        <w:t>ssh gns3@192.168.56.101 "cd ~/plataforma &amp;&amp; docker compose ps"</w:t>
+      </w:r>
+    </w:p>
+    <w:p>
+      <w:pPr>
+        <w:spacing w:after="120"/>
+      </w:pPr>
+      <w:r>
+        <w:t xml:space="preserve">Deben aparecer seis servicios </w:t>
+      </w:r>
+      <w:r>
+        <w:rPr>
+          <w:rFonts w:ascii="Consolas" w:eastAsia="Consolas" w:hAnsi="Consolas" w:cs="Consolas"/>
+          <w:color w:val="7B2C2C"/>
+          <w:sz w:val="19"/>
+          <w:szCs w:val="19"/>
+        </w:rPr>
+        <w:t>Up</w:t>
+      </w:r>
+      <w:r>
+        <w:t xml:space="preserve"> y </w:t>
+      </w:r>
+      <w:r>
+        <w:rPr>
+          <w:rFonts w:ascii="Consolas" w:eastAsia="Consolas" w:hAnsi="Consolas" w:cs="Consolas"/>
+          <w:color w:val="7B2C2C"/>
+          <w:sz w:val="19"/>
+          <w:szCs w:val="19"/>
+        </w:rPr>
+        <w:t>plataforma</w:t>
+      </w:r>
+      <w:r>
+        <w:t xml:space="preserve"> como </w:t>
+      </w:r>
+      <w:r>
+        <w:rPr>
+          <w:rFonts w:ascii="Consolas" w:eastAsia="Consolas" w:hAnsi="Consolas" w:cs="Consolas"/>
+          <w:color w:val="7B2C2C"/>
+          <w:sz w:val="19"/>
+          <w:szCs w:val="19"/>
+        </w:rPr>
+        <w:t>healthy</w:t>
+      </w:r>
+      <w:r>
+        <w:t>.</w:t>
+      </w:r>
+    </w:p>
+    <w:p>
+      <w:pPr>
+        <w:pStyle w:val="Prrafodelista"/>
+        <w:numPr>
+          <w:ilvl w:val="0"/>
+          <w:numId w:val="2"/>
+        </w:numPr>
+        <w:spacing w:after="60"/>
+      </w:pPr>
+      <w:r>
+        <w:t>Abrir el túnel en una ventana de PowerShell, desde la carpeta del proyecto, y dejarla abierta:</w:t>
+      </w:r>
+    </w:p>
+    <w:p>
+      <w:pPr>
+        <w:shd w:val="clear" w:color="auto" w:fill="F2F2F2"/>
+        <w:spacing w:before="80" w:after="160" w:line="240" w:lineRule="auto"/>
+        <w:ind w:left="200" w:right="200"/>
+      </w:pPr>
+      <w:r>
+        <w:rPr>
+          <w:rFonts w:ascii="Consolas" w:eastAsia="Consolas" w:hAnsi="Consolas" w:cs="Consolas"/>
+          <w:sz w:val="17"/>
+          <w:szCs w:val="17"/>
+        </w:rPr>
+        <w:t>powershell -ExecutionPolicy Bypass -File .\scripts\windows\tunel.ps1</w:t>
+      </w:r>
+    </w:p>
+    <w:p>
+      <w:pPr>
+        <w:pStyle w:val="Prrafodelista"/>
+        <w:numPr>
+          <w:ilvl w:val="0"/>
+          <w:numId w:val="2"/>
+        </w:numPr>
+        <w:spacing w:after="60"/>
+      </w:pPr>
+      <w:r>
+        <w:t xml:space="preserve">Abrir </w:t>
+      </w:r>
+      <w:r>
+        <w:rPr>
+          <w:rFonts w:ascii="Consolas" w:eastAsia="Consolas" w:hAnsi="Consolas" w:cs="Consolas"/>
+          <w:b/>
+          <w:bCs/>
+          <w:color w:val="7B2C2C"/>
+          <w:sz w:val="19"/>
+          <w:szCs w:val="19"/>
+        </w:rPr>
+        <w:t>http://localhost:8000</w:t>
+      </w:r>
+      <w:r>
+        <w:t xml:space="preserve">, siempre con </w:t>
+      </w:r>
+      <w:r>
+        <w:rPr>
+          <w:rFonts w:ascii="Consolas" w:eastAsia="Consolas" w:hAnsi="Consolas" w:cs="Consolas"/>
+          <w:color w:val="7B2C2C"/>
+          <w:sz w:val="19"/>
+          <w:szCs w:val="19"/>
+        </w:rPr>
+        <w:t>localhost</w:t>
+      </w:r>
+      <w:r>
+        <w:t xml:space="preserve"> y no con la IP: WebAuthn rechaza las direcciones IP. Ingresar con contraseña y passkey. Si el navegador ofrece guardar en Google o en Windows, elegir "Guardar de otra forma" o "Cambiar" → "iPhone, iPad o dispositivo Android" y escanear el QR con el teléfono.</w:t>
+      </w:r>
+    </w:p>
+    <w:p>
+      <w:pPr>
+        <w:pStyle w:val="Prrafodelista"/>
+        <w:numPr>
+          <w:ilvl w:val="0"/>
+          <w:numId w:val="2"/>
+        </w:numPr>
+        <w:spacing w:after="60"/>
+      </w:pPr>
+      <w:r>
+        <w:t>En la pestaña Red debe leerse "Captura real eth2" con seis equipos en línea.</w:t>
+      </w:r>
+    </w:p>
+    <w:p>
+      <w:pPr>
+        <w:spacing w:after="120"/>
+      </w:pPr>
+      <w:r>
+        <w:t>El ping de los Alpine hacia 10.10.10.1 no recibe respuesta y es normal: la plataforma detecta a los equipos por sus solicitudes ARP. Se recomiendan 2 o más CPU para la GNS3 VM (sección 10).</w:t>
+      </w:r>
+    </w:p>
+    <w:p>
+      <w:pPr>
+        <w:pStyle w:val="Ttulo2"/>
+        <w:keepNext/>
+      </w:pPr>
+      <w:bookmarkStart w:id="4" w:name="_Toc242520262"/>
+      <w:r>
+        <w:t>3.2 Cuentas necesarias</w:t>
+      </w:r>
+      <w:bookmarkEnd w:id="4"/>
     </w:p>
     <w:tbl>
       <w:tblPr>
@@ -4500,7 +5273,6 @@
                 <w:sz w:val="17"/>
                 <w:szCs w:val="17"/>
               </w:rPr>
-              <w:lastRenderedPageBreak/>
               <w:t>administrador</w:t>
             </w:r>
           </w:p>
@@ -4575,11 +5347,11 @@
         <w:pStyle w:val="Ttulo2"/>
         <w:keepNext/>
       </w:pPr>
-      <w:bookmarkStart w:id="4" w:name="_Toc242517536"/>
+      <w:bookmarkStart w:id="5" w:name="_Toc242520263"/>
       <w:r>
-        <w:t>3.2 Estado inicial limpio</w:t>
+        <w:t>3.3 Estado inicial limpio</w:t>
       </w:r>
-      <w:bookmarkEnd w:id="4"/>
+      <w:bookmarkEnd w:id="5"/>
     </w:p>
     <w:p>
       <w:pPr>
@@ -4827,11 +5599,12 @@
         <w:pStyle w:val="Ttulo2"/>
         <w:keepNext/>
       </w:pPr>
-      <w:bookmarkStart w:id="5" w:name="_Toc242517537"/>
+      <w:bookmarkStart w:id="6" w:name="_Toc242520264"/>
       <w:r>
-        <w:t>3.3 Cómo se registra la evidencia</w:t>
+        <w:lastRenderedPageBreak/>
+        <w:t>3.4 Cómo se registra la evidencia</w:t>
       </w:r>
-      <w:bookmarkEnd w:id="5"/>
+      <w:bookmarkEnd w:id="6"/>
     </w:p>
     <w:p>
       <w:pPr>
@@ -4945,22 +5718,22 @@
         <w:pStyle w:val="Ttulo1"/>
         <w:keepNext/>
       </w:pPr>
-      <w:bookmarkStart w:id="6" w:name="_Toc242517538"/>
+      <w:bookmarkStart w:id="7" w:name="_Toc242520265"/>
       <w:r>
         <w:t>4. Energía</w:t>
       </w:r>
-      <w:bookmarkEnd w:id="6"/>
+      <w:bookmarkEnd w:id="7"/>
     </w:p>
     <w:p>
       <w:pPr>
         <w:pStyle w:val="Ttulo2"/>
         <w:keepNext/>
       </w:pPr>
-      <w:bookmarkStart w:id="7" w:name="_Toc242517539"/>
+      <w:bookmarkStart w:id="8" w:name="_Toc242520266"/>
       <w:r>
         <w:t>4.1 Modelo</w:t>
       </w:r>
-      <w:bookmarkEnd w:id="7"/>
+      <w:bookmarkEnd w:id="8"/>
     </w:p>
     <w:tbl>
       <w:tblPr>
@@ -5829,7 +6602,6 @@
                 <w:sz w:val="19"/>
                 <w:szCs w:val="19"/>
               </w:rPr>
-              <w:lastRenderedPageBreak/>
               <w:t>Aceleración del tiempo</w:t>
             </w:r>
           </w:p>
@@ -6009,11 +6781,12 @@
         <w:pStyle w:val="Ttulo2"/>
         <w:keepNext/>
       </w:pPr>
-      <w:bookmarkStart w:id="8" w:name="_Toc242517540"/>
+      <w:bookmarkStart w:id="9" w:name="_Toc242520267"/>
       <w:r>
+        <w:lastRenderedPageBreak/>
         <w:t>4.2 Escenarios</w:t>
       </w:r>
-      <w:bookmarkEnd w:id="8"/>
+      <w:bookmarkEnd w:id="9"/>
     </w:p>
     <w:p>
       <w:pPr>
@@ -7247,7 +8020,6 @@
                 <w:sz w:val="19"/>
                 <w:szCs w:val="19"/>
               </w:rPr>
-              <w:lastRenderedPageBreak/>
               <w:t xml:space="preserve">Tiempos del ensayo desde </w:t>
             </w:r>
             <w:r>
@@ -7720,6 +8492,7 @@
                 <w:sz w:val="19"/>
                 <w:szCs w:val="19"/>
               </w:rPr>
+              <w:lastRenderedPageBreak/>
               <w:t>Control y norma</w:t>
             </w:r>
           </w:p>
@@ -7886,22 +8659,22 @@
         <w:pStyle w:val="Ttulo1"/>
         <w:keepNext/>
       </w:pPr>
-      <w:bookmarkStart w:id="9" w:name="_Toc242517541"/>
+      <w:bookmarkStart w:id="10" w:name="_Toc242520268"/>
       <w:r>
         <w:t>5. Ambiente</w:t>
       </w:r>
-      <w:bookmarkEnd w:id="9"/>
+      <w:bookmarkEnd w:id="10"/>
     </w:p>
     <w:p>
       <w:pPr>
         <w:pStyle w:val="Ttulo2"/>
         <w:keepNext/>
       </w:pPr>
-      <w:bookmarkStart w:id="10" w:name="_Toc242517542"/>
+      <w:bookmarkStart w:id="11" w:name="_Toc242520269"/>
       <w:r>
         <w:t>5.1 Modelo</w:t>
       </w:r>
-      <w:bookmarkEnd w:id="10"/>
+      <w:bookmarkEnd w:id="11"/>
     </w:p>
     <w:tbl>
       <w:tblPr>
@@ -8736,12 +9509,11 @@
         <w:pStyle w:val="Ttulo2"/>
         <w:keepNext/>
       </w:pPr>
-      <w:bookmarkStart w:id="11" w:name="_Toc242517543"/>
+      <w:bookmarkStart w:id="12" w:name="_Toc242520270"/>
       <w:r>
-        <w:lastRenderedPageBreak/>
         <w:t>5.2 Escenarios</w:t>
       </w:r>
-      <w:bookmarkEnd w:id="11"/>
+      <w:bookmarkEnd w:id="12"/>
     </w:p>
     <w:p>
       <w:pPr>
@@ -9240,6 +10012,7 @@
                 <w:sz w:val="19"/>
                 <w:szCs w:val="19"/>
               </w:rPr>
+              <w:lastRenderedPageBreak/>
               <w:t>Eventos</w:t>
             </w:r>
           </w:p>
@@ -10381,23 +11154,22 @@
         <w:pStyle w:val="Ttulo1"/>
         <w:keepNext/>
       </w:pPr>
-      <w:bookmarkStart w:id="12" w:name="_Toc242517544"/>
+      <w:bookmarkStart w:id="13" w:name="_Toc242520271"/>
       <w:r>
-        <w:lastRenderedPageBreak/>
         <w:t>6. Acceso físico</w:t>
       </w:r>
-      <w:bookmarkEnd w:id="12"/>
+      <w:bookmarkEnd w:id="13"/>
     </w:p>
     <w:p>
       <w:pPr>
         <w:pStyle w:val="Ttulo2"/>
         <w:keepNext/>
       </w:pPr>
-      <w:bookmarkStart w:id="13" w:name="_Toc242517545"/>
+      <w:bookmarkStart w:id="14" w:name="_Toc242520272"/>
       <w:r>
         <w:t>6.1 Modelo</w:t>
       </w:r>
-      <w:bookmarkEnd w:id="13"/>
+      <w:bookmarkEnd w:id="14"/>
     </w:p>
     <w:tbl>
       <w:tblPr>
@@ -10841,6 +11613,7 @@
         <w:spacing w:after="120"/>
       </w:pPr>
       <w:r>
+        <w:lastRenderedPageBreak/>
         <w:t>Tarjetas de prueba:</w:t>
       </w:r>
     </w:p>
@@ -11573,11 +12346,11 @@
         <w:pStyle w:val="Ttulo2"/>
         <w:keepNext/>
       </w:pPr>
-      <w:bookmarkStart w:id="14" w:name="_Toc242517546"/>
+      <w:bookmarkStart w:id="15" w:name="_Toc242520273"/>
       <w:r>
         <w:t>6.2 Escenarios</w:t>
       </w:r>
-      <w:bookmarkEnd w:id="14"/>
+      <w:bookmarkEnd w:id="15"/>
     </w:p>
     <w:tbl>
       <w:tblPr>
@@ -12628,7 +13401,6 @@
         <w:spacing w:after="120"/>
       </w:pPr>
       <w:r>
-        <w:lastRenderedPageBreak/>
         <w:t>Punto de auditoría para P2: el evento se registra como crítico y aparece en las alertas del tablero, pero la respuesta enviada a la lectora es la misma que en un ingreso válido.</w:t>
       </w:r>
     </w:p>
@@ -12637,11 +13409,11 @@
         <w:pStyle w:val="Ttulo1"/>
         <w:keepNext/>
       </w:pPr>
-      <w:bookmarkStart w:id="15" w:name="_Toc242517547"/>
+      <w:bookmarkStart w:id="16" w:name="_Toc242520274"/>
       <w:r>
         <w:t>7. Red</w:t>
       </w:r>
-      <w:bookmarkEnd w:id="15"/>
+      <w:bookmarkEnd w:id="16"/>
     </w:p>
     <w:p>
       <w:pPr>
@@ -13000,6 +13772,7 @@
                 <w:sz w:val="19"/>
                 <w:szCs w:val="19"/>
               </w:rPr>
+              <w:lastRenderedPageBreak/>
               <w:t>#</w:t>
             </w:r>
           </w:p>
@@ -13775,11 +14548,11 @@
         <w:pStyle w:val="Ttulo1"/>
         <w:keepNext/>
       </w:pPr>
-      <w:bookmarkStart w:id="16" w:name="_Toc242517548"/>
+      <w:bookmarkStart w:id="17" w:name="_Toc242520275"/>
       <w:r>
         <w:t>8. Respuesta a incidentes</w:t>
       </w:r>
-      <w:bookmarkEnd w:id="16"/>
+      <w:bookmarkEnd w:id="17"/>
     </w:p>
     <w:p>
       <w:pPr>
@@ -14118,22 +14891,22 @@
         <w:pStyle w:val="Ttulo1"/>
         <w:keepNext/>
       </w:pPr>
-      <w:bookmarkStart w:id="17" w:name="_Toc242517549"/>
+      <w:bookmarkStart w:id="18" w:name="_Toc242520276"/>
       <w:r>
         <w:t>9. Verificación de la evidencia</w:t>
       </w:r>
-      <w:bookmarkEnd w:id="17"/>
+      <w:bookmarkEnd w:id="18"/>
     </w:p>
     <w:p>
       <w:pPr>
         <w:pStyle w:val="Ttulo2"/>
         <w:keepNext/>
       </w:pPr>
-      <w:bookmarkStart w:id="18" w:name="_Toc242517550"/>
+      <w:bookmarkStart w:id="19" w:name="_Toc242520277"/>
       <w:r>
         <w:t>9.1 Integridad de la bitácora</w:t>
       </w:r>
-      <w:bookmarkEnd w:id="18"/>
+      <w:bookmarkEnd w:id="19"/>
     </w:p>
     <w:p>
       <w:pPr>
@@ -14475,6 +15248,7 @@
                 <w:sz w:val="19"/>
                 <w:szCs w:val="19"/>
               </w:rPr>
+              <w:lastRenderedPageBreak/>
               <w:t>Exportación</w:t>
             </w:r>
           </w:p>
@@ -14736,11 +15510,11 @@
         <w:pStyle w:val="Ttulo2"/>
         <w:keepNext/>
       </w:pPr>
-      <w:bookmarkStart w:id="19" w:name="_Toc242517551"/>
+      <w:bookmarkStart w:id="20" w:name="_Toc242520278"/>
       <w:r>
         <w:t>9.2 Matriz de trazabilidad</w:t>
       </w:r>
-      <w:bookmarkEnd w:id="19"/>
+      <w:bookmarkEnd w:id="20"/>
     </w:p>
     <w:tbl>
       <w:tblPr>
@@ -16161,7 +16935,6 @@
                 <w:sz w:val="19"/>
                 <w:szCs w:val="19"/>
               </w:rPr>
-              <w:lastRenderedPageBreak/>
               <w:t>8.15 Registro</w:t>
             </w:r>
           </w:p>
@@ -16543,11 +17316,11 @@
         <w:pStyle w:val="Ttulo2"/>
         <w:keepNext/>
       </w:pPr>
-      <w:bookmarkStart w:id="20" w:name="_Toc242517552"/>
+      <w:bookmarkStart w:id="21" w:name="_Toc242520279"/>
       <w:r>
         <w:t>9.3 Indicadores</w:t>
       </w:r>
-      <w:bookmarkEnd w:id="20"/>
+      <w:bookmarkEnd w:id="21"/>
     </w:p>
     <w:p>
       <w:pPr>
@@ -16562,11 +17335,12 @@
         <w:pStyle w:val="Ttulo1"/>
         <w:keepNext/>
       </w:pPr>
-      <w:bookmarkStart w:id="21" w:name="_Toc242517553"/>
+      <w:bookmarkStart w:id="22" w:name="_Toc242520280"/>
       <w:r>
+        <w:lastRenderedPageBreak/>
         <w:t>10. Limitaciones conocidas</w:t>
       </w:r>
-      <w:bookmarkEnd w:id="21"/>
+      <w:bookmarkEnd w:id="22"/>
     </w:p>
     <w:tbl>
       <w:tblPr>
@@ -17015,7 +17789,7 @@
                 <w:sz w:val="19"/>
                 <w:szCs w:val="19"/>
               </w:rPr>
-              <w:t xml:space="preserve"> (hallazgo H1). La VM de Azure tiene 4 CPU para evitarlo</w:t>
+              <w:t xml:space="preserve"> (hallazgo H1). Se recomienda asignar 2 o más CPU a la GNS3 VM en VirtualBox</w:t>
             </w:r>
           </w:p>
         </w:tc>
@@ -17289,10 +18063,10 @@
 <file path=word/numbering.xml><?xml version="1.0" encoding="utf-8"?>
 <w:numbering xmlns:wpc="http://schemas.microsoft.com/office/word/2010/wordprocessingCanvas" xmlns:cx="http://schemas.microsoft.com/office/drawing/2014/chartex" xmlns:cx1="http://schemas.microsoft.com/office/drawing/2015/9/8/chartex" xmlns:cx2="http://schemas.microsoft.com/office/drawing/2015/10/21/chartex" xmlns:cx3="http://schemas.microsoft.com/office/drawing/2016/5/9/chartex" xmlns:cx4="http://schemas.microsoft.com/office/drawing/2016/5/10/chartex" xmlns:cx5="http://schemas.microsoft.com/office/drawing/2016/5/11/chartex" xmlns:cx6="http://schemas.microsoft.com/office/drawing/2016/5/12/chartex" xmlns:cx7="http://schemas.microsoft.com/office/drawing/2016/5/13/chartex" xmlns:cx8="http://schemas.microsoft.com/office/drawing/2016/5/14/chartex" xmlns:mc="http://schemas.openxmlformats.org/markup-compatibility/2006" xmlns:aink="http://schemas.microsoft.com/office/drawing/2016/ink" xmlns:am3d="http://schemas.microsoft.com/office/drawing/2017/model3d" xmlns:o="urn:schemas-microsoft-com:office:office" xmlns:oel="http://schemas.microsoft.com/office/2019/extlst" xmlns:r="http://schemas.openxmlformats.org/officeDocument/2006/relationships" xmlns:m="http://schemas.openxmlformats.org/officeDocument/2006/math" xmlns:v="urn:schemas-microsoft-com:vml" xmlns:wp14="http://schemas.microsoft.com/office/word/2010/wordprocessingDrawing" xmlns:wp="http://schemas.openxmlformats.org/drawingml/2006/wordprocessingDrawing" xmlns:w10="urn:schemas-microsoft-com:office:word" xmlns:w="http://schemas.openxmlformats.org/wordprocessingml/2006/main" xmlns:w14="http://schemas.microsoft.com/office/word/2010/wordml" xmlns:w15="http://schemas.microsoft.com/office/word/2012/wordml" xmlns:w16cex="http://schemas.microsoft.com/office/word/2018/wordml/cex" xmlns:w16cid="http://schemas.microsoft.com/office/word/2016/wordml/cid" xmlns:w16="http://schemas.microsoft.com/office/word/2018/wordml" xmlns:w16du="http://schemas.microsoft.com/office/word/2023/wordml/word16du" xmlns:w16sdtdh="http://schemas.microsoft.com/office/word/2020/wordml/sdtdatahash" xmlns:w16sdtfl="http://schemas.microsoft.com/office/word/2024/wordml/sdtformatlock" xmlns:w16se="http://schemas.microsoft.com/office/word/2015/wordml/symex" xmlns:wpg="http://schemas.microsoft.com/office/word/2010/wordprocessingGroup" xmlns:wpi="http://schemas.microsoft.com/office/word/2010/wordprocessingInk" xmlns:wne="http://schemas.microsoft.com/office/word/2006/wordml" xmlns:wps="http://schemas.microsoft.com/office/word/2010/wordprocessingShape" mc:Ignorable="w14 w15 w16se w16cid w16 w16cex w16sdtdh w16sdtfl w16du wp14">
   <w:abstractNum w:abstractNumId="0" w15:restartNumberingAfterBreak="0">
-    <w:nsid w:val="538019A4"/>
+    <w:nsid w:val="001C710F"/>
     <w:multiLevelType w:val="hybridMultilevel"/>
-    <w:tmpl w:val="21563D90"/>
-    <w:lvl w:ilvl="0" w:tplc="388810FE" w:tentative="1">
+    <w:tmpl w:val="56D4586A"/>
+    <w:lvl w:ilvl="0" w:tplc="3D5443D6" w:tentative="1">
       <w:start w:val="1"/>
       <w:numFmt w:val="bullet"/>
       <w:lvlText w:val="●"/>
@@ -17301,7 +18075,7 @@
         <w:ind w:left="720" w:hanging="360"/>
       </w:pPr>
     </w:lvl>
-    <w:lvl w:ilvl="1" w:tplc="617A02F4" w:tentative="1">
+    <w:lvl w:ilvl="1" w:tplc="CF406896" w:tentative="1">
       <w:start w:val="1"/>
       <w:numFmt w:val="bullet"/>
       <w:lvlText w:val="○"/>
@@ -17310,7 +18084,7 @@
         <w:ind w:left="1440" w:hanging="360"/>
       </w:pPr>
     </w:lvl>
-    <w:lvl w:ilvl="2" w:tplc="BB182DFA" w:tentative="1">
+    <w:lvl w:ilvl="2" w:tplc="CEF8B7DC" w:tentative="1">
       <w:start w:val="1"/>
       <w:numFmt w:val="bullet"/>
       <w:lvlText w:val="■"/>
@@ -17319,7 +18093,7 @@
         <w:ind w:left="2160" w:hanging="360"/>
       </w:pPr>
     </w:lvl>
-    <w:lvl w:ilvl="3" w:tplc="5CAC8A84" w:tentative="1">
+    <w:lvl w:ilvl="3" w:tplc="F32EDC94" w:tentative="1">
       <w:start w:val="1"/>
       <w:numFmt w:val="bullet"/>
       <w:lvlText w:val="●"/>
@@ -17328,7 +18102,7 @@
         <w:ind w:left="2880" w:hanging="360"/>
       </w:pPr>
     </w:lvl>
-    <w:lvl w:ilvl="4" w:tplc="94DA0440" w:tentative="1">
+    <w:lvl w:ilvl="4" w:tplc="B5CA7850" w:tentative="1">
       <w:start w:val="1"/>
       <w:numFmt w:val="bullet"/>
       <w:lvlText w:val="○"/>
@@ -17337,7 +18111,7 @@
         <w:ind w:left="3600" w:hanging="360"/>
       </w:pPr>
     </w:lvl>
-    <w:lvl w:ilvl="5" w:tplc="78BADD3C" w:tentative="1">
+    <w:lvl w:ilvl="5" w:tplc="25DE1DA2" w:tentative="1">
       <w:start w:val="1"/>
       <w:numFmt w:val="bullet"/>
       <w:lvlText w:val="■"/>
@@ -17346,7 +18120,7 @@
         <w:ind w:left="4320" w:hanging="360"/>
       </w:pPr>
     </w:lvl>
-    <w:lvl w:ilvl="6" w:tplc="E1A0530C" w:tentative="1">
+    <w:lvl w:ilvl="6" w:tplc="57468C28" w:tentative="1">
       <w:start w:val="1"/>
       <w:numFmt w:val="bullet"/>
       <w:lvlText w:val="●"/>
@@ -17355,7 +18129,7 @@
         <w:ind w:left="5040" w:hanging="360"/>
       </w:pPr>
     </w:lvl>
-    <w:lvl w:ilvl="7" w:tplc="7B284D60" w:tentative="1">
+    <w:lvl w:ilvl="7" w:tplc="811EC644" w:tentative="1">
       <w:start w:val="1"/>
       <w:numFmt w:val="bullet"/>
       <w:lvlText w:val="●"/>
@@ -17364,7 +18138,7 @@
         <w:ind w:left="5760" w:hanging="360"/>
       </w:pPr>
     </w:lvl>
-    <w:lvl w:ilvl="8" w:tplc="B86A3F5C" w:tentative="1">
+    <w:lvl w:ilvl="8" w:tplc="C29EBC26" w:tentative="1">
       <w:start w:val="1"/>
       <w:numFmt w:val="bullet"/>
       <w:lvlText w:val="●"/>
@@ -17375,10 +18149,10 @@
     </w:lvl>
   </w:abstractNum>
   <w:abstractNum w:abstractNumId="1" w15:restartNumberingAfterBreak="0">
-    <w:nsid w:val="66C57079"/>
+    <w:nsid w:val="382E071F"/>
     <w:multiLevelType w:val="hybridMultilevel"/>
-    <w:tmpl w:val="3440F69C"/>
-    <w:lvl w:ilvl="0" w:tplc="7F903D5E">
+    <w:tmpl w:val="A7B07B7A"/>
+    <w:lvl w:ilvl="0" w:tplc="6E96EF9E">
       <w:start w:val="1"/>
       <w:numFmt w:val="decimal"/>
       <w:lvlText w:val="%1."/>
@@ -17387,52 +18161,52 @@
         <w:ind w:left="540" w:hanging="300"/>
       </w:pPr>
     </w:lvl>
-    <w:lvl w:ilvl="1" w:tplc="A5D08728">
+    <w:lvl w:ilvl="1" w:tplc="1BA02280">
       <w:numFmt w:val="decimal"/>
       <w:lvlText w:val=""/>
       <w:lvlJc w:val="left"/>
     </w:lvl>
-    <w:lvl w:ilvl="2" w:tplc="A11075A0">
+    <w:lvl w:ilvl="2" w:tplc="CAFEF26A">
       <w:numFmt w:val="decimal"/>
       <w:lvlText w:val=""/>
       <w:lvlJc w:val="left"/>
     </w:lvl>
-    <w:lvl w:ilvl="3" w:tplc="FF0E89BE">
+    <w:lvl w:ilvl="3" w:tplc="80B4EA74">
       <w:numFmt w:val="decimal"/>
       <w:lvlText w:val=""/>
       <w:lvlJc w:val="left"/>
     </w:lvl>
-    <w:lvl w:ilvl="4" w:tplc="BE0204F2">
+    <w:lvl w:ilvl="4" w:tplc="14C2C7A8">
       <w:numFmt w:val="decimal"/>
       <w:lvlText w:val=""/>
       <w:lvlJc w:val="left"/>
     </w:lvl>
-    <w:lvl w:ilvl="5" w:tplc="2DEC1FAC">
+    <w:lvl w:ilvl="5" w:tplc="EF66D21E">
       <w:numFmt w:val="decimal"/>
       <w:lvlText w:val=""/>
       <w:lvlJc w:val="left"/>
     </w:lvl>
-    <w:lvl w:ilvl="6" w:tplc="58B6D11C">
+    <w:lvl w:ilvl="6" w:tplc="439C4D16">
       <w:numFmt w:val="decimal"/>
       <w:lvlText w:val=""/>
       <w:lvlJc w:val="left"/>
     </w:lvl>
-    <w:lvl w:ilvl="7" w:tplc="CFCC832A">
+    <w:lvl w:ilvl="7" w:tplc="A3962F40">
       <w:numFmt w:val="decimal"/>
       <w:lvlText w:val=""/>
       <w:lvlJc w:val="left"/>
     </w:lvl>
-    <w:lvl w:ilvl="8" w:tplc="835E3E2A">
+    <w:lvl w:ilvl="8" w:tplc="1388B89C">
       <w:numFmt w:val="decimal"/>
       <w:lvlText w:val=""/>
       <w:lvlJc w:val="left"/>
     </w:lvl>
   </w:abstractNum>
   <w:abstractNum w:abstractNumId="2" w15:restartNumberingAfterBreak="0">
-    <w:nsid w:val="7F5A6871"/>
+    <w:nsid w:val="75AD419C"/>
     <w:multiLevelType w:val="hybridMultilevel"/>
-    <w:tmpl w:val="20723836"/>
-    <w:lvl w:ilvl="0" w:tplc="C32C1690" w:tentative="1">
+    <w:tmpl w:val="7EFAC8C2"/>
+    <w:lvl w:ilvl="0" w:tplc="6F7E9A9C" w:tentative="1">
       <w:start w:val="1"/>
       <w:numFmt w:val="bullet"/>
       <w:lvlText w:val="•"/>
@@ -17441,54 +18215,54 @@
         <w:ind w:left="540" w:hanging="270"/>
       </w:pPr>
     </w:lvl>
-    <w:lvl w:ilvl="1" w:tplc="06623AF8">
+    <w:lvl w:ilvl="1" w:tplc="E848CF1C">
       <w:numFmt w:val="decimal"/>
       <w:lvlText w:val=""/>
       <w:lvlJc w:val="left"/>
     </w:lvl>
-    <w:lvl w:ilvl="2" w:tplc="A2E22AD2">
+    <w:lvl w:ilvl="2" w:tplc="112635F8">
       <w:numFmt w:val="decimal"/>
       <w:lvlText w:val=""/>
       <w:lvlJc w:val="left"/>
     </w:lvl>
-    <w:lvl w:ilvl="3" w:tplc="FEACCC32">
+    <w:lvl w:ilvl="3" w:tplc="F1E0A202">
       <w:numFmt w:val="decimal"/>
       <w:lvlText w:val=""/>
       <w:lvlJc w:val="left"/>
     </w:lvl>
-    <w:lvl w:ilvl="4" w:tplc="4516BD90">
+    <w:lvl w:ilvl="4" w:tplc="BDE0BF46">
       <w:numFmt w:val="decimal"/>
       <w:lvlText w:val=""/>
       <w:lvlJc w:val="left"/>
     </w:lvl>
-    <w:lvl w:ilvl="5" w:tplc="EE1C6202">
+    <w:lvl w:ilvl="5" w:tplc="654690D8">
       <w:numFmt w:val="decimal"/>
       <w:lvlText w:val=""/>
       <w:lvlJc w:val="left"/>
     </w:lvl>
-    <w:lvl w:ilvl="6" w:tplc="3AFAD804">
+    <w:lvl w:ilvl="6" w:tplc="5C2ECFD2">
       <w:numFmt w:val="decimal"/>
       <w:lvlText w:val=""/>
       <w:lvlJc w:val="left"/>
     </w:lvl>
-    <w:lvl w:ilvl="7" w:tplc="B5700274">
+    <w:lvl w:ilvl="7" w:tplc="2CBCB410">
       <w:numFmt w:val="decimal"/>
       <w:lvlText w:val=""/>
       <w:lvlJc w:val="left"/>
     </w:lvl>
-    <w:lvl w:ilvl="8" w:tplc="8AF668C8">
+    <w:lvl w:ilvl="8" w:tplc="47CA8654">
       <w:numFmt w:val="decimal"/>
       <w:lvlText w:val=""/>
       <w:lvlJc w:val="left"/>
     </w:lvl>
   </w:abstractNum>
-  <w:num w:numId="1" w16cid:durableId="1191842003">
+  <w:num w:numId="1" w16cid:durableId="430855376">
     <w:abstractNumId w:val="0"/>
     <w:lvlOverride w:ilvl="0">
       <w:startOverride w:val="1"/>
     </w:lvlOverride>
   </w:num>
-  <w:num w:numId="2" w16cid:durableId="998734073">
+  <w:num w:numId="2" w16cid:durableId="709305877">
     <w:abstractNumId w:val="1"/>
     <w:lvlOverride w:ilvl="0">
       <w:startOverride w:val="1"/>
@@ -18142,7 +18916,7 @@
     <w:autoRedefine/>
     <w:uiPriority w:val="39"/>
     <w:unhideWhenUsed/>
-    <w:rsid w:val="005501BE"/>
+    <w:rsid w:val="00BA6A90"/>
     <w:pPr>
       <w:spacing w:after="100"/>
     </w:pPr>
@@ -18154,7 +18928,7 @@
     <w:autoRedefine/>
     <w:uiPriority w:val="39"/>
     <w:unhideWhenUsed/>
-    <w:rsid w:val="005501BE"/>
+    <w:rsid w:val="00BA6A90"/>
     <w:pPr>
       <w:spacing w:after="100"/>
       <w:ind w:left="210"/>

</xml_diff>

<commit_message>
Nube: arranque automático de la topología y control de MAC; manuales con anexo de cuentas y numeración corregida; hallazgos H4 y H5
</commit_message>
<xml_diff>
--- a/docs/entregables/Manual_Simulaciones_Auditoria.docx
+++ b/docs/entregables/Manual_Simulaciones_Auditoria.docx
@@ -211,7 +211,7 @@
     <w:sdt>
       <w:sdtPr>
         <w:alias w:val="Contenido"/>
-        <w:id w:val="-372467021"/>
+        <w:id w:val="897705105"/>
       </w:sdtPr>
       <w:sdtEndPr/>
       <w:sdtContent>
@@ -234,7 +234,7 @@
           <w:r>
             <w:fldChar w:fldCharType="separate"/>
           </w:r>
-          <w:hyperlink w:anchor="_Toc242520258" w:history="1">
+          <w:hyperlink w:anchor="_Toc242541499" w:history="1">
             <w:r>
               <w:rPr>
                 <w:rStyle w:val="Hipervnculo"/>
@@ -258,7 +258,7 @@
               <w:rPr>
                 <w:noProof/>
               </w:rPr>
-              <w:instrText xml:space="preserve"> PAGEREF _Toc242520258 \h </w:instrText>
+              <w:instrText xml:space="preserve"> PAGEREF _Toc242541499 \h </w:instrText>
             </w:r>
             <w:r>
               <w:rPr>
@@ -295,7 +295,7 @@
               <w:noProof/>
             </w:rPr>
           </w:pPr>
-          <w:hyperlink w:anchor="_Toc242520259" w:history="1">
+          <w:hyperlink w:anchor="_Toc242541500" w:history="1">
             <w:r>
               <w:rPr>
                 <w:rStyle w:val="Hipervnculo"/>
@@ -319,7 +319,7 @@
               <w:rPr>
                 <w:noProof/>
               </w:rPr>
-              <w:instrText xml:space="preserve"> PAGEREF _Toc242520259 \h </w:instrText>
+              <w:instrText xml:space="preserve"> PAGEREF _Toc242541500 \h </w:instrText>
             </w:r>
             <w:r>
               <w:rPr>
@@ -356,7 +356,7 @@
               <w:noProof/>
             </w:rPr>
           </w:pPr>
-          <w:hyperlink w:anchor="_Toc242520260" w:history="1">
+          <w:hyperlink w:anchor="_Toc242541501" w:history="1">
             <w:r>
               <w:rPr>
                 <w:rStyle w:val="Hipervnculo"/>
@@ -380,7 +380,7 @@
               <w:rPr>
                 <w:noProof/>
               </w:rPr>
-              <w:instrText xml:space="preserve"> PAGEREF _Toc242520260 \h </w:instrText>
+              <w:instrText xml:space="preserve"> PAGEREF _Toc242541501 \h </w:instrText>
             </w:r>
             <w:r>
               <w:rPr>
@@ -417,7 +417,7 @@
               <w:noProof/>
             </w:rPr>
           </w:pPr>
-          <w:hyperlink w:anchor="_Toc242520261" w:history="1">
+          <w:hyperlink w:anchor="_Toc242541502" w:history="1">
             <w:r>
               <w:rPr>
                 <w:rStyle w:val="Hipervnculo"/>
@@ -441,7 +441,7 @@
               <w:rPr>
                 <w:noProof/>
               </w:rPr>
-              <w:instrText xml:space="preserve"> PAGEREF _Toc242520261 \h </w:instrText>
+              <w:instrText xml:space="preserve"> PAGEREF _Toc242541502 \h </w:instrText>
             </w:r>
             <w:r>
               <w:rPr>
@@ -478,7 +478,7 @@
               <w:noProof/>
             </w:rPr>
           </w:pPr>
-          <w:hyperlink w:anchor="_Toc242520262" w:history="1">
+          <w:hyperlink w:anchor="_Toc242541503" w:history="1">
             <w:r>
               <w:rPr>
                 <w:rStyle w:val="Hipervnculo"/>
@@ -502,7 +502,7 @@
               <w:rPr>
                 <w:noProof/>
               </w:rPr>
-              <w:instrText xml:space="preserve"> PAGEREF _Toc242520262 \h </w:instrText>
+              <w:instrText xml:space="preserve"> PAGEREF _Toc242541503 \h </w:instrText>
             </w:r>
             <w:r>
               <w:rPr>
@@ -539,7 +539,7 @@
               <w:noProof/>
             </w:rPr>
           </w:pPr>
-          <w:hyperlink w:anchor="_Toc242520263" w:history="1">
+          <w:hyperlink w:anchor="_Toc242541504" w:history="1">
             <w:r>
               <w:rPr>
                 <w:rStyle w:val="Hipervnculo"/>
@@ -563,7 +563,7 @@
               <w:rPr>
                 <w:noProof/>
               </w:rPr>
-              <w:instrText xml:space="preserve"> PAGEREF _Toc242520263 \h </w:instrText>
+              <w:instrText xml:space="preserve"> PAGEREF _Toc242541504 \h </w:instrText>
             </w:r>
             <w:r>
               <w:rPr>
@@ -600,7 +600,7 @@
               <w:noProof/>
             </w:rPr>
           </w:pPr>
-          <w:hyperlink w:anchor="_Toc242520264" w:history="1">
+          <w:hyperlink w:anchor="_Toc242541505" w:history="1">
             <w:r>
               <w:rPr>
                 <w:rStyle w:val="Hipervnculo"/>
@@ -624,7 +624,7 @@
               <w:rPr>
                 <w:noProof/>
               </w:rPr>
-              <w:instrText xml:space="preserve"> PAGEREF _Toc242520264 \h </w:instrText>
+              <w:instrText xml:space="preserve"> PAGEREF _Toc242541505 \h </w:instrText>
             </w:r>
             <w:r>
               <w:rPr>
@@ -661,7 +661,7 @@
               <w:noProof/>
             </w:rPr>
           </w:pPr>
-          <w:hyperlink w:anchor="_Toc242520265" w:history="1">
+          <w:hyperlink w:anchor="_Toc242541506" w:history="1">
             <w:r>
               <w:rPr>
                 <w:rStyle w:val="Hipervnculo"/>
@@ -685,7 +685,7 @@
               <w:rPr>
                 <w:noProof/>
               </w:rPr>
-              <w:instrText xml:space="preserve"> PAGEREF _Toc242520265 \h </w:instrText>
+              <w:instrText xml:space="preserve"> PAGEREF _Toc242541506 \h </w:instrText>
             </w:r>
             <w:r>
               <w:rPr>
@@ -722,7 +722,7 @@
               <w:noProof/>
             </w:rPr>
           </w:pPr>
-          <w:hyperlink w:anchor="_Toc242520266" w:history="1">
+          <w:hyperlink w:anchor="_Toc242541507" w:history="1">
             <w:r>
               <w:rPr>
                 <w:rStyle w:val="Hipervnculo"/>
@@ -746,7 +746,7 @@
               <w:rPr>
                 <w:noProof/>
               </w:rPr>
-              <w:instrText xml:space="preserve"> PAGEREF _Toc242520266 \h </w:instrText>
+              <w:instrText xml:space="preserve"> PAGEREF _Toc242541507 \h </w:instrText>
             </w:r>
             <w:r>
               <w:rPr>
@@ -783,7 +783,7 @@
               <w:noProof/>
             </w:rPr>
           </w:pPr>
-          <w:hyperlink w:anchor="_Toc242520267" w:history="1">
+          <w:hyperlink w:anchor="_Toc242541508" w:history="1">
             <w:r>
               <w:rPr>
                 <w:rStyle w:val="Hipervnculo"/>
@@ -807,7 +807,7 @@
               <w:rPr>
                 <w:noProof/>
               </w:rPr>
-              <w:instrText xml:space="preserve"> PAGEREF _Toc242520267 \h </w:instrText>
+              <w:instrText xml:space="preserve"> PAGEREF _Toc242541508 \h </w:instrText>
             </w:r>
             <w:r>
               <w:rPr>
@@ -844,7 +844,7 @@
               <w:noProof/>
             </w:rPr>
           </w:pPr>
-          <w:hyperlink w:anchor="_Toc242520268" w:history="1">
+          <w:hyperlink w:anchor="_Toc242541509" w:history="1">
             <w:r>
               <w:rPr>
                 <w:rStyle w:val="Hipervnculo"/>
@@ -868,7 +868,7 @@
               <w:rPr>
                 <w:noProof/>
               </w:rPr>
-              <w:instrText xml:space="preserve"> PAGEREF _Toc242520268 \h </w:instrText>
+              <w:instrText xml:space="preserve"> PAGEREF _Toc242541509 \h </w:instrText>
             </w:r>
             <w:r>
               <w:rPr>
@@ -905,7 +905,7 @@
               <w:noProof/>
             </w:rPr>
           </w:pPr>
-          <w:hyperlink w:anchor="_Toc242520269" w:history="1">
+          <w:hyperlink w:anchor="_Toc242541510" w:history="1">
             <w:r>
               <w:rPr>
                 <w:rStyle w:val="Hipervnculo"/>
@@ -929,7 +929,7 @@
               <w:rPr>
                 <w:noProof/>
               </w:rPr>
-              <w:instrText xml:space="preserve"> PAGEREF _Toc242520269 \h </w:instrText>
+              <w:instrText xml:space="preserve"> PAGEREF _Toc242541510 \h </w:instrText>
             </w:r>
             <w:r>
               <w:rPr>
@@ -966,7 +966,7 @@
               <w:noProof/>
             </w:rPr>
           </w:pPr>
-          <w:hyperlink w:anchor="_Toc242520270" w:history="1">
+          <w:hyperlink w:anchor="_Toc242541511" w:history="1">
             <w:r>
               <w:rPr>
                 <w:rStyle w:val="Hipervnculo"/>
@@ -990,7 +990,7 @@
               <w:rPr>
                 <w:noProof/>
               </w:rPr>
-              <w:instrText xml:space="preserve"> PAGEREF _Toc242520270 \h </w:instrText>
+              <w:instrText xml:space="preserve"> PAGEREF _Toc242541511 \h </w:instrText>
             </w:r>
             <w:r>
               <w:rPr>
@@ -1027,7 +1027,7 @@
               <w:noProof/>
             </w:rPr>
           </w:pPr>
-          <w:hyperlink w:anchor="_Toc242520271" w:history="1">
+          <w:hyperlink w:anchor="_Toc242541512" w:history="1">
             <w:r>
               <w:rPr>
                 <w:rStyle w:val="Hipervnculo"/>
@@ -1051,7 +1051,7 @@
               <w:rPr>
                 <w:noProof/>
               </w:rPr>
-              <w:instrText xml:space="preserve"> PAGEREF _Toc242520271 \h </w:instrText>
+              <w:instrText xml:space="preserve"> PAGEREF _Toc242541512 \h </w:instrText>
             </w:r>
             <w:r>
               <w:rPr>
@@ -1088,7 +1088,7 @@
               <w:noProof/>
             </w:rPr>
           </w:pPr>
-          <w:hyperlink w:anchor="_Toc242520272" w:history="1">
+          <w:hyperlink w:anchor="_Toc242541513" w:history="1">
             <w:r>
               <w:rPr>
                 <w:rStyle w:val="Hipervnculo"/>
@@ -1112,7 +1112,7 @@
               <w:rPr>
                 <w:noProof/>
               </w:rPr>
-              <w:instrText xml:space="preserve"> PAGEREF _Toc242520272 \h </w:instrText>
+              <w:instrText xml:space="preserve"> PAGEREF _Toc242541513 \h </w:instrText>
             </w:r>
             <w:r>
               <w:rPr>
@@ -1149,7 +1149,7 @@
               <w:noProof/>
             </w:rPr>
           </w:pPr>
-          <w:hyperlink w:anchor="_Toc242520273" w:history="1">
+          <w:hyperlink w:anchor="_Toc242541514" w:history="1">
             <w:r>
               <w:rPr>
                 <w:rStyle w:val="Hipervnculo"/>
@@ -1173,7 +1173,7 @@
               <w:rPr>
                 <w:noProof/>
               </w:rPr>
-              <w:instrText xml:space="preserve"> PAGEREF _Toc242520273 \h </w:instrText>
+              <w:instrText xml:space="preserve"> PAGEREF _Toc242541514 \h </w:instrText>
             </w:r>
             <w:r>
               <w:rPr>
@@ -1210,7 +1210,7 @@
               <w:noProof/>
             </w:rPr>
           </w:pPr>
-          <w:hyperlink w:anchor="_Toc242520274" w:history="1">
+          <w:hyperlink w:anchor="_Toc242541515" w:history="1">
             <w:r>
               <w:rPr>
                 <w:rStyle w:val="Hipervnculo"/>
@@ -1234,7 +1234,7 @@
               <w:rPr>
                 <w:noProof/>
               </w:rPr>
-              <w:instrText xml:space="preserve"> PAGEREF _Toc242520274 \h </w:instrText>
+              <w:instrText xml:space="preserve"> PAGEREF _Toc242541515 \h </w:instrText>
             </w:r>
             <w:r>
               <w:rPr>
@@ -1271,7 +1271,7 @@
               <w:noProof/>
             </w:rPr>
           </w:pPr>
-          <w:hyperlink w:anchor="_Toc242520275" w:history="1">
+          <w:hyperlink w:anchor="_Toc242541516" w:history="1">
             <w:r>
               <w:rPr>
                 <w:rStyle w:val="Hipervnculo"/>
@@ -1295,7 +1295,7 @@
               <w:rPr>
                 <w:noProof/>
               </w:rPr>
-              <w:instrText xml:space="preserve"> PAGEREF _Toc242520275 \h </w:instrText>
+              <w:instrText xml:space="preserve"> PAGEREF _Toc242541516 \h </w:instrText>
             </w:r>
             <w:r>
               <w:rPr>
@@ -1332,7 +1332,7 @@
               <w:noProof/>
             </w:rPr>
           </w:pPr>
-          <w:hyperlink w:anchor="_Toc242520276" w:history="1">
+          <w:hyperlink w:anchor="_Toc242541517" w:history="1">
             <w:r>
               <w:rPr>
                 <w:rStyle w:val="Hipervnculo"/>
@@ -1356,7 +1356,7 @@
               <w:rPr>
                 <w:noProof/>
               </w:rPr>
-              <w:instrText xml:space="preserve"> PAGEREF _Toc242520276 \h </w:instrText>
+              <w:instrText xml:space="preserve"> PAGEREF _Toc242541517 \h </w:instrText>
             </w:r>
             <w:r>
               <w:rPr>
@@ -1393,7 +1393,7 @@
               <w:noProof/>
             </w:rPr>
           </w:pPr>
-          <w:hyperlink w:anchor="_Toc242520277" w:history="1">
+          <w:hyperlink w:anchor="_Toc242541518" w:history="1">
             <w:r>
               <w:rPr>
                 <w:rStyle w:val="Hipervnculo"/>
@@ -1417,7 +1417,7 @@
               <w:rPr>
                 <w:noProof/>
               </w:rPr>
-              <w:instrText xml:space="preserve"> PAGEREF _Toc242520277 \h </w:instrText>
+              <w:instrText xml:space="preserve"> PAGEREF _Toc242541518 \h </w:instrText>
             </w:r>
             <w:r>
               <w:rPr>
@@ -1454,7 +1454,7 @@
               <w:noProof/>
             </w:rPr>
           </w:pPr>
-          <w:hyperlink w:anchor="_Toc242520278" w:history="1">
+          <w:hyperlink w:anchor="_Toc242541519" w:history="1">
             <w:r>
               <w:rPr>
                 <w:rStyle w:val="Hipervnculo"/>
@@ -1478,7 +1478,7 @@
               <w:rPr>
                 <w:noProof/>
               </w:rPr>
-              <w:instrText xml:space="preserve"> PAGEREF _Toc242520278 \h </w:instrText>
+              <w:instrText xml:space="preserve"> PAGEREF _Toc242541519 \h </w:instrText>
             </w:r>
             <w:r>
               <w:rPr>
@@ -1515,7 +1515,7 @@
               <w:noProof/>
             </w:rPr>
           </w:pPr>
-          <w:hyperlink w:anchor="_Toc242520279" w:history="1">
+          <w:hyperlink w:anchor="_Toc242541520" w:history="1">
             <w:r>
               <w:rPr>
                 <w:rStyle w:val="Hipervnculo"/>
@@ -1539,7 +1539,7 @@
               <w:rPr>
                 <w:noProof/>
               </w:rPr>
-              <w:instrText xml:space="preserve"> PAGEREF _Toc242520279 \h </w:instrText>
+              <w:instrText xml:space="preserve"> PAGEREF _Toc242541520 \h </w:instrText>
             </w:r>
             <w:r>
               <w:rPr>
@@ -1576,7 +1576,7 @@
               <w:noProof/>
             </w:rPr>
           </w:pPr>
-          <w:hyperlink w:anchor="_Toc242520280" w:history="1">
+          <w:hyperlink w:anchor="_Toc242541521" w:history="1">
             <w:r>
               <w:rPr>
                 <w:rStyle w:val="Hipervnculo"/>
@@ -1600,7 +1600,7 @@
               <w:rPr>
                 <w:noProof/>
               </w:rPr>
-              <w:instrText xml:space="preserve"> PAGEREF _Toc242520280 \h </w:instrText>
+              <w:instrText xml:space="preserve"> PAGEREF _Toc242541521 \h </w:instrText>
             </w:r>
             <w:r>
               <w:rPr>
@@ -1687,7 +1687,7 @@
         <w:pStyle w:val="Ttulo1"/>
         <w:keepNext/>
       </w:pPr>
-      <w:bookmarkStart w:id="0" w:name="_Toc242520258"/>
+      <w:bookmarkStart w:id="0" w:name="_Toc242541499"/>
       <w:r>
         <w:t>1. Alcance y carácter simulado</w:t>
       </w:r>
@@ -2357,7 +2357,7 @@
         <w:pStyle w:val="Ttulo1"/>
         <w:keepNext/>
       </w:pPr>
-      <w:bookmarkStart w:id="1" w:name="_Toc242520259"/>
+      <w:bookmarkStart w:id="1" w:name="_Toc242541500"/>
       <w:r>
         <w:t>2. Marco normativo aplicado</w:t>
       </w:r>
@@ -4243,7 +4243,7 @@
         <w:pStyle w:val="Ttulo1"/>
         <w:keepNext/>
       </w:pPr>
-      <w:bookmarkStart w:id="2" w:name="_Toc242520260"/>
+      <w:bookmarkStart w:id="2" w:name="_Toc242541501"/>
       <w:r>
         <w:t>3. Preparación para auditar</w:t>
       </w:r>
@@ -4254,7 +4254,7 @@
         <w:pStyle w:val="Ttulo2"/>
         <w:keepNext/>
       </w:pPr>
-      <w:bookmarkStart w:id="3" w:name="_Toc242520261"/>
+      <w:bookmarkStart w:id="3" w:name="_Toc242541502"/>
       <w:r>
         <w:t>3.1 Ejecución local</w:t>
       </w:r>
@@ -5036,7 +5036,7 @@
         <w:pStyle w:val="Ttulo2"/>
         <w:keepNext/>
       </w:pPr>
-      <w:bookmarkStart w:id="4" w:name="_Toc242520262"/>
+      <w:bookmarkStart w:id="4" w:name="_Toc242541503"/>
       <w:r>
         <w:t>3.2 Cuentas necesarias</w:t>
       </w:r>
@@ -5347,7 +5347,7 @@
         <w:pStyle w:val="Ttulo2"/>
         <w:keepNext/>
       </w:pPr>
-      <w:bookmarkStart w:id="5" w:name="_Toc242520263"/>
+      <w:bookmarkStart w:id="5" w:name="_Toc242541504"/>
       <w:r>
         <w:t>3.3 Estado inicial limpio</w:t>
       </w:r>
@@ -5599,7 +5599,7 @@
         <w:pStyle w:val="Ttulo2"/>
         <w:keepNext/>
       </w:pPr>
-      <w:bookmarkStart w:id="6" w:name="_Toc242520264"/>
+      <w:bookmarkStart w:id="6" w:name="_Toc242541505"/>
       <w:r>
         <w:lastRenderedPageBreak/>
         <w:t>3.4 Cómo se registra la evidencia</w:t>
@@ -5611,7 +5611,7 @@
         <w:pStyle w:val="Prrafodelista"/>
         <w:numPr>
           <w:ilvl w:val="0"/>
-          <w:numId w:val="2"/>
+          <w:numId w:val="3"/>
         </w:numPr>
         <w:spacing w:after="60"/>
       </w:pPr>
@@ -5648,7 +5648,7 @@
         <w:pStyle w:val="Prrafodelista"/>
         <w:numPr>
           <w:ilvl w:val="0"/>
-          <w:numId w:val="2"/>
+          <w:numId w:val="3"/>
         </w:numPr>
         <w:spacing w:after="60"/>
       </w:pPr>
@@ -5661,7 +5661,7 @@
         <w:pStyle w:val="Prrafodelista"/>
         <w:numPr>
           <w:ilvl w:val="0"/>
-          <w:numId w:val="2"/>
+          <w:numId w:val="3"/>
         </w:numPr>
         <w:spacing w:after="60"/>
       </w:pPr>
@@ -5718,7 +5718,7 @@
         <w:pStyle w:val="Ttulo1"/>
         <w:keepNext/>
       </w:pPr>
-      <w:bookmarkStart w:id="7" w:name="_Toc242520265"/>
+      <w:bookmarkStart w:id="7" w:name="_Toc242541506"/>
       <w:r>
         <w:t>4. Energía</w:t>
       </w:r>
@@ -5729,7 +5729,7 @@
         <w:pStyle w:val="Ttulo2"/>
         <w:keepNext/>
       </w:pPr>
-      <w:bookmarkStart w:id="8" w:name="_Toc242520266"/>
+      <w:bookmarkStart w:id="8" w:name="_Toc242541507"/>
       <w:r>
         <w:t>4.1 Modelo</w:t>
       </w:r>
@@ -6781,7 +6781,7 @@
         <w:pStyle w:val="Ttulo2"/>
         <w:keepNext/>
       </w:pPr>
-      <w:bookmarkStart w:id="9" w:name="_Toc242520267"/>
+      <w:bookmarkStart w:id="9" w:name="_Toc242541508"/>
       <w:r>
         <w:lastRenderedPageBreak/>
         <w:t>4.2 Escenarios</w:t>
@@ -8659,7 +8659,7 @@
         <w:pStyle w:val="Ttulo1"/>
         <w:keepNext/>
       </w:pPr>
-      <w:bookmarkStart w:id="10" w:name="_Toc242520268"/>
+      <w:bookmarkStart w:id="10" w:name="_Toc242541509"/>
       <w:r>
         <w:t>5. Ambiente</w:t>
       </w:r>
@@ -8670,7 +8670,7 @@
         <w:pStyle w:val="Ttulo2"/>
         <w:keepNext/>
       </w:pPr>
-      <w:bookmarkStart w:id="11" w:name="_Toc242520269"/>
+      <w:bookmarkStart w:id="11" w:name="_Toc242541510"/>
       <w:r>
         <w:t>5.1 Modelo</w:t>
       </w:r>
@@ -9509,7 +9509,7 @@
         <w:pStyle w:val="Ttulo2"/>
         <w:keepNext/>
       </w:pPr>
-      <w:bookmarkStart w:id="12" w:name="_Toc242520270"/>
+      <w:bookmarkStart w:id="12" w:name="_Toc242541511"/>
       <w:r>
         <w:t>5.2 Escenarios</w:t>
       </w:r>
@@ -11154,7 +11154,7 @@
         <w:pStyle w:val="Ttulo1"/>
         <w:keepNext/>
       </w:pPr>
-      <w:bookmarkStart w:id="13" w:name="_Toc242520271"/>
+      <w:bookmarkStart w:id="13" w:name="_Toc242541512"/>
       <w:r>
         <w:t>6. Acceso físico</w:t>
       </w:r>
@@ -11165,7 +11165,7 @@
         <w:pStyle w:val="Ttulo2"/>
         <w:keepNext/>
       </w:pPr>
-      <w:bookmarkStart w:id="14" w:name="_Toc242520272"/>
+      <w:bookmarkStart w:id="14" w:name="_Toc242541513"/>
       <w:r>
         <w:t>6.1 Modelo</w:t>
       </w:r>
@@ -12346,7 +12346,7 @@
         <w:pStyle w:val="Ttulo2"/>
         <w:keepNext/>
       </w:pPr>
-      <w:bookmarkStart w:id="15" w:name="_Toc242520273"/>
+      <w:bookmarkStart w:id="15" w:name="_Toc242541514"/>
       <w:r>
         <w:t>6.2 Escenarios</w:t>
       </w:r>
@@ -13409,7 +13409,7 @@
         <w:pStyle w:val="Ttulo1"/>
         <w:keepNext/>
       </w:pPr>
-      <w:bookmarkStart w:id="16" w:name="_Toc242520274"/>
+      <w:bookmarkStart w:id="16" w:name="_Toc242541515"/>
       <w:r>
         <w:t>7. Red</w:t>
       </w:r>
@@ -14548,7 +14548,7 @@
         <w:pStyle w:val="Ttulo1"/>
         <w:keepNext/>
       </w:pPr>
-      <w:bookmarkStart w:id="17" w:name="_Toc242520275"/>
+      <w:bookmarkStart w:id="17" w:name="_Toc242541516"/>
       <w:r>
         <w:t>8. Respuesta a incidentes</w:t>
       </w:r>
@@ -14891,7 +14891,7 @@
         <w:pStyle w:val="Ttulo1"/>
         <w:keepNext/>
       </w:pPr>
-      <w:bookmarkStart w:id="18" w:name="_Toc242520276"/>
+      <w:bookmarkStart w:id="18" w:name="_Toc242541517"/>
       <w:r>
         <w:t>9. Verificación de la evidencia</w:t>
       </w:r>
@@ -14902,7 +14902,7 @@
         <w:pStyle w:val="Ttulo2"/>
         <w:keepNext/>
       </w:pPr>
-      <w:bookmarkStart w:id="19" w:name="_Toc242520277"/>
+      <w:bookmarkStart w:id="19" w:name="_Toc242541518"/>
       <w:r>
         <w:t>9.1 Integridad de la bitácora</w:t>
       </w:r>
@@ -15510,7 +15510,7 @@
         <w:pStyle w:val="Ttulo2"/>
         <w:keepNext/>
       </w:pPr>
-      <w:bookmarkStart w:id="20" w:name="_Toc242520278"/>
+      <w:bookmarkStart w:id="20" w:name="_Toc242541519"/>
       <w:r>
         <w:t>9.2 Matriz de trazabilidad</w:t>
       </w:r>
@@ -17316,7 +17316,7 @@
         <w:pStyle w:val="Ttulo2"/>
         <w:keepNext/>
       </w:pPr>
-      <w:bookmarkStart w:id="21" w:name="_Toc242520279"/>
+      <w:bookmarkStart w:id="21" w:name="_Toc242541520"/>
       <w:r>
         <w:t>9.3 Indicadores</w:t>
       </w:r>
@@ -17335,7 +17335,7 @@
         <w:pStyle w:val="Ttulo1"/>
         <w:keepNext/>
       </w:pPr>
-      <w:bookmarkStart w:id="22" w:name="_Toc242520280"/>
+      <w:bookmarkStart w:id="22" w:name="_Toc242541521"/>
       <w:r>
         <w:lastRenderedPageBreak/>
         <w:t>10. Limitaciones conocidas</w:t>
@@ -18063,10 +18063,118 @@
 <file path=word/numbering.xml><?xml version="1.0" encoding="utf-8"?>
 <w:numbering xmlns:wpc="http://schemas.microsoft.com/office/word/2010/wordprocessingCanvas" xmlns:cx="http://schemas.microsoft.com/office/drawing/2014/chartex" xmlns:cx1="http://schemas.microsoft.com/office/drawing/2015/9/8/chartex" xmlns:cx2="http://schemas.microsoft.com/office/drawing/2015/10/21/chartex" xmlns:cx3="http://schemas.microsoft.com/office/drawing/2016/5/9/chartex" xmlns:cx4="http://schemas.microsoft.com/office/drawing/2016/5/10/chartex" xmlns:cx5="http://schemas.microsoft.com/office/drawing/2016/5/11/chartex" xmlns:cx6="http://schemas.microsoft.com/office/drawing/2016/5/12/chartex" xmlns:cx7="http://schemas.microsoft.com/office/drawing/2016/5/13/chartex" xmlns:cx8="http://schemas.microsoft.com/office/drawing/2016/5/14/chartex" xmlns:mc="http://schemas.openxmlformats.org/markup-compatibility/2006" xmlns:aink="http://schemas.microsoft.com/office/drawing/2016/ink" xmlns:am3d="http://schemas.microsoft.com/office/drawing/2017/model3d" xmlns:o="urn:schemas-microsoft-com:office:office" xmlns:oel="http://schemas.microsoft.com/office/2019/extlst" xmlns:r="http://schemas.openxmlformats.org/officeDocument/2006/relationships" xmlns:m="http://schemas.openxmlformats.org/officeDocument/2006/math" xmlns:v="urn:schemas-microsoft-com:vml" xmlns:wp14="http://schemas.microsoft.com/office/word/2010/wordprocessingDrawing" xmlns:wp="http://schemas.openxmlformats.org/drawingml/2006/wordprocessingDrawing" xmlns:w10="urn:schemas-microsoft-com:office:word" xmlns:w="http://schemas.openxmlformats.org/wordprocessingml/2006/main" xmlns:w14="http://schemas.microsoft.com/office/word/2010/wordml" xmlns:w15="http://schemas.microsoft.com/office/word/2012/wordml" xmlns:w16cex="http://schemas.microsoft.com/office/word/2018/wordml/cex" xmlns:w16cid="http://schemas.microsoft.com/office/word/2016/wordml/cid" xmlns:w16="http://schemas.microsoft.com/office/word/2018/wordml" xmlns:w16du="http://schemas.microsoft.com/office/word/2023/wordml/word16du" xmlns:w16sdtdh="http://schemas.microsoft.com/office/word/2020/wordml/sdtdatahash" xmlns:w16sdtfl="http://schemas.microsoft.com/office/word/2024/wordml/sdtformatlock" xmlns:w16se="http://schemas.microsoft.com/office/word/2015/wordml/symex" xmlns:wpg="http://schemas.microsoft.com/office/word/2010/wordprocessingGroup" xmlns:wpi="http://schemas.microsoft.com/office/word/2010/wordprocessingInk" xmlns:wne="http://schemas.microsoft.com/office/word/2006/wordml" xmlns:wps="http://schemas.microsoft.com/office/word/2010/wordprocessingShape" mc:Ignorable="w14 w15 w16se w16cid w16 w16cex w16sdtdh w16sdtfl w16du wp14">
   <w:abstractNum w:abstractNumId="0" w15:restartNumberingAfterBreak="0">
-    <w:nsid w:val="001C710F"/>
+    <w:nsid w:val="169F01F6"/>
     <w:multiLevelType w:val="hybridMultilevel"/>
-    <w:tmpl w:val="56D4586A"/>
-    <w:lvl w:ilvl="0" w:tplc="3D5443D6" w:tentative="1">
+    <w:tmpl w:val="D62E19F4"/>
+    <w:lvl w:ilvl="0" w:tplc="117ADCE4" w:tentative="1">
+      <w:start w:val="1"/>
+      <w:numFmt w:val="bullet"/>
+      <w:lvlText w:val="•"/>
+      <w:lvlJc w:val="left"/>
+      <w:pPr>
+        <w:ind w:left="540" w:hanging="270"/>
+      </w:pPr>
+    </w:lvl>
+    <w:lvl w:ilvl="1" w:tplc="DB2A995A">
+      <w:numFmt w:val="decimal"/>
+      <w:lvlText w:val=""/>
+      <w:lvlJc w:val="left"/>
+    </w:lvl>
+    <w:lvl w:ilvl="2" w:tplc="BF84DB30">
+      <w:numFmt w:val="decimal"/>
+      <w:lvlText w:val=""/>
+      <w:lvlJc w:val="left"/>
+    </w:lvl>
+    <w:lvl w:ilvl="3" w:tplc="539ACA00">
+      <w:numFmt w:val="decimal"/>
+      <w:lvlText w:val=""/>
+      <w:lvlJc w:val="left"/>
+    </w:lvl>
+    <w:lvl w:ilvl="4" w:tplc="D5EA3166">
+      <w:numFmt w:val="decimal"/>
+      <w:lvlText w:val=""/>
+      <w:lvlJc w:val="left"/>
+    </w:lvl>
+    <w:lvl w:ilvl="5" w:tplc="8B68864E">
+      <w:numFmt w:val="decimal"/>
+      <w:lvlText w:val=""/>
+      <w:lvlJc w:val="left"/>
+    </w:lvl>
+    <w:lvl w:ilvl="6" w:tplc="C3D8CB8A">
+      <w:numFmt w:val="decimal"/>
+      <w:lvlText w:val=""/>
+      <w:lvlJc w:val="left"/>
+    </w:lvl>
+    <w:lvl w:ilvl="7" w:tplc="E58A7E50">
+      <w:numFmt w:val="decimal"/>
+      <w:lvlText w:val=""/>
+      <w:lvlJc w:val="left"/>
+    </w:lvl>
+    <w:lvl w:ilvl="8" w:tplc="57469A0A">
+      <w:numFmt w:val="decimal"/>
+      <w:lvlText w:val=""/>
+      <w:lvlJc w:val="left"/>
+    </w:lvl>
+  </w:abstractNum>
+  <w:abstractNum w:abstractNumId="1" w15:restartNumberingAfterBreak="0">
+    <w:nsid w:val="65897658"/>
+    <w:multiLevelType w:val="hybridMultilevel"/>
+    <w:tmpl w:val="BEE6FBF2"/>
+    <w:lvl w:ilvl="0" w:tplc="06788FB4">
+      <w:start w:val="1"/>
+      <w:numFmt w:val="decimal"/>
+      <w:lvlText w:val="%1."/>
+      <w:lvlJc w:val="left"/>
+      <w:pPr>
+        <w:ind w:left="540" w:hanging="300"/>
+      </w:pPr>
+    </w:lvl>
+    <w:lvl w:ilvl="1" w:tplc="998AD4CC">
+      <w:numFmt w:val="decimal"/>
+      <w:lvlText w:val=""/>
+      <w:lvlJc w:val="left"/>
+    </w:lvl>
+    <w:lvl w:ilvl="2" w:tplc="1CDCA762">
+      <w:numFmt w:val="decimal"/>
+      <w:lvlText w:val=""/>
+      <w:lvlJc w:val="left"/>
+    </w:lvl>
+    <w:lvl w:ilvl="3" w:tplc="FDDA61F2">
+      <w:numFmt w:val="decimal"/>
+      <w:lvlText w:val=""/>
+      <w:lvlJc w:val="left"/>
+    </w:lvl>
+    <w:lvl w:ilvl="4" w:tplc="092A072A">
+      <w:numFmt w:val="decimal"/>
+      <w:lvlText w:val=""/>
+      <w:lvlJc w:val="left"/>
+    </w:lvl>
+    <w:lvl w:ilvl="5" w:tplc="4AD2EC90">
+      <w:numFmt w:val="decimal"/>
+      <w:lvlText w:val=""/>
+      <w:lvlJc w:val="left"/>
+    </w:lvl>
+    <w:lvl w:ilvl="6" w:tplc="F62A6054">
+      <w:numFmt w:val="decimal"/>
+      <w:lvlText w:val=""/>
+      <w:lvlJc w:val="left"/>
+    </w:lvl>
+    <w:lvl w:ilvl="7" w:tplc="FF1200D4">
+      <w:numFmt w:val="decimal"/>
+      <w:lvlText w:val=""/>
+      <w:lvlJc w:val="left"/>
+    </w:lvl>
+    <w:lvl w:ilvl="8" w:tplc="3A2E7116">
+      <w:numFmt w:val="decimal"/>
+      <w:lvlText w:val=""/>
+      <w:lvlJc w:val="left"/>
+    </w:lvl>
+  </w:abstractNum>
+  <w:abstractNum w:abstractNumId="2" w15:restartNumberingAfterBreak="0">
+    <w:nsid w:val="71FE5C5F"/>
+    <w:multiLevelType w:val="hybridMultilevel"/>
+    <w:tmpl w:val="C8AE668E"/>
+    <w:lvl w:ilvl="0" w:tplc="E3CEEB5A" w:tentative="1">
       <w:start w:val="1"/>
       <w:numFmt w:val="bullet"/>
       <w:lvlText w:val="●"/>
@@ -18075,7 +18183,7 @@
         <w:ind w:left="720" w:hanging="360"/>
       </w:pPr>
     </w:lvl>
-    <w:lvl w:ilvl="1" w:tplc="CF406896" w:tentative="1">
+    <w:lvl w:ilvl="1" w:tplc="956028FE" w:tentative="1">
       <w:start w:val="1"/>
       <w:numFmt w:val="bullet"/>
       <w:lvlText w:val="○"/>
@@ -18084,7 +18192,7 @@
         <w:ind w:left="1440" w:hanging="360"/>
       </w:pPr>
     </w:lvl>
-    <w:lvl w:ilvl="2" w:tplc="CEF8B7DC" w:tentative="1">
+    <w:lvl w:ilvl="2" w:tplc="ED42A80A" w:tentative="1">
       <w:start w:val="1"/>
       <w:numFmt w:val="bullet"/>
       <w:lvlText w:val="■"/>
@@ -18093,7 +18201,7 @@
         <w:ind w:left="2160" w:hanging="360"/>
       </w:pPr>
     </w:lvl>
-    <w:lvl w:ilvl="3" w:tplc="F32EDC94" w:tentative="1">
+    <w:lvl w:ilvl="3" w:tplc="F70E6612" w:tentative="1">
       <w:start w:val="1"/>
       <w:numFmt w:val="bullet"/>
       <w:lvlText w:val="●"/>
@@ -18102,7 +18210,7 @@
         <w:ind w:left="2880" w:hanging="360"/>
       </w:pPr>
     </w:lvl>
-    <w:lvl w:ilvl="4" w:tplc="B5CA7850" w:tentative="1">
+    <w:lvl w:ilvl="4" w:tplc="504279EE" w:tentative="1">
       <w:start w:val="1"/>
       <w:numFmt w:val="bullet"/>
       <w:lvlText w:val="○"/>
@@ -18111,7 +18219,7 @@
         <w:ind w:left="3600" w:hanging="360"/>
       </w:pPr>
     </w:lvl>
-    <w:lvl w:ilvl="5" w:tplc="25DE1DA2" w:tentative="1">
+    <w:lvl w:ilvl="5" w:tplc="1C787076" w:tentative="1">
       <w:start w:val="1"/>
       <w:numFmt w:val="bullet"/>
       <w:lvlText w:val="■"/>
@@ -18120,7 +18228,7 @@
         <w:ind w:left="4320" w:hanging="360"/>
       </w:pPr>
     </w:lvl>
-    <w:lvl w:ilvl="6" w:tplc="57468C28" w:tentative="1">
+    <w:lvl w:ilvl="6" w:tplc="D2E2E4C6" w:tentative="1">
       <w:start w:val="1"/>
       <w:numFmt w:val="bullet"/>
       <w:lvlText w:val="●"/>
@@ -18129,7 +18237,7 @@
         <w:ind w:left="5040" w:hanging="360"/>
       </w:pPr>
     </w:lvl>
-    <w:lvl w:ilvl="7" w:tplc="811EC644" w:tentative="1">
+    <w:lvl w:ilvl="7" w:tplc="2EAE3930" w:tentative="1">
       <w:start w:val="1"/>
       <w:numFmt w:val="bullet"/>
       <w:lvlText w:val="●"/>
@@ -18138,7 +18246,7 @@
         <w:ind w:left="5760" w:hanging="360"/>
       </w:pPr>
     </w:lvl>
-    <w:lvl w:ilvl="8" w:tplc="C29EBC26" w:tentative="1">
+    <w:lvl w:ilvl="8" w:tplc="6A72EF08" w:tentative="1">
       <w:start w:val="1"/>
       <w:numFmt w:val="bullet"/>
       <w:lvlText w:val="●"/>
@@ -18148,121 +18256,19 @@
       </w:pPr>
     </w:lvl>
   </w:abstractNum>
-  <w:abstractNum w:abstractNumId="1" w15:restartNumberingAfterBreak="0">
-    <w:nsid w:val="382E071F"/>
-    <w:multiLevelType w:val="hybridMultilevel"/>
-    <w:tmpl w:val="A7B07B7A"/>
-    <w:lvl w:ilvl="0" w:tplc="6E96EF9E">
-      <w:start w:val="1"/>
-      <w:numFmt w:val="decimal"/>
-      <w:lvlText w:val="%1."/>
-      <w:lvlJc w:val="left"/>
-      <w:pPr>
-        <w:ind w:left="540" w:hanging="300"/>
-      </w:pPr>
-    </w:lvl>
-    <w:lvl w:ilvl="1" w:tplc="1BA02280">
-      <w:numFmt w:val="decimal"/>
-      <w:lvlText w:val=""/>
-      <w:lvlJc w:val="left"/>
-    </w:lvl>
-    <w:lvl w:ilvl="2" w:tplc="CAFEF26A">
-      <w:numFmt w:val="decimal"/>
-      <w:lvlText w:val=""/>
-      <w:lvlJc w:val="left"/>
-    </w:lvl>
-    <w:lvl w:ilvl="3" w:tplc="80B4EA74">
-      <w:numFmt w:val="decimal"/>
-      <w:lvlText w:val=""/>
-      <w:lvlJc w:val="left"/>
-    </w:lvl>
-    <w:lvl w:ilvl="4" w:tplc="14C2C7A8">
-      <w:numFmt w:val="decimal"/>
-      <w:lvlText w:val=""/>
-      <w:lvlJc w:val="left"/>
-    </w:lvl>
-    <w:lvl w:ilvl="5" w:tplc="EF66D21E">
-      <w:numFmt w:val="decimal"/>
-      <w:lvlText w:val=""/>
-      <w:lvlJc w:val="left"/>
-    </w:lvl>
-    <w:lvl w:ilvl="6" w:tplc="439C4D16">
-      <w:numFmt w:val="decimal"/>
-      <w:lvlText w:val=""/>
-      <w:lvlJc w:val="left"/>
-    </w:lvl>
-    <w:lvl w:ilvl="7" w:tplc="A3962F40">
-      <w:numFmt w:val="decimal"/>
-      <w:lvlText w:val=""/>
-      <w:lvlJc w:val="left"/>
-    </w:lvl>
-    <w:lvl w:ilvl="8" w:tplc="1388B89C">
-      <w:numFmt w:val="decimal"/>
-      <w:lvlText w:val=""/>
-      <w:lvlJc w:val="left"/>
-    </w:lvl>
-  </w:abstractNum>
-  <w:abstractNum w:abstractNumId="2" w15:restartNumberingAfterBreak="0">
-    <w:nsid w:val="75AD419C"/>
-    <w:multiLevelType w:val="hybridMultilevel"/>
-    <w:tmpl w:val="7EFAC8C2"/>
-    <w:lvl w:ilvl="0" w:tplc="6F7E9A9C" w:tentative="1">
-      <w:start w:val="1"/>
-      <w:numFmt w:val="bullet"/>
-      <w:lvlText w:val="•"/>
-      <w:lvlJc w:val="left"/>
-      <w:pPr>
-        <w:ind w:left="540" w:hanging="270"/>
-      </w:pPr>
-    </w:lvl>
-    <w:lvl w:ilvl="1" w:tplc="E848CF1C">
-      <w:numFmt w:val="decimal"/>
-      <w:lvlText w:val=""/>
-      <w:lvlJc w:val="left"/>
-    </w:lvl>
-    <w:lvl w:ilvl="2" w:tplc="112635F8">
-      <w:numFmt w:val="decimal"/>
-      <w:lvlText w:val=""/>
-      <w:lvlJc w:val="left"/>
-    </w:lvl>
-    <w:lvl w:ilvl="3" w:tplc="F1E0A202">
-      <w:numFmt w:val="decimal"/>
-      <w:lvlText w:val=""/>
-      <w:lvlJc w:val="left"/>
-    </w:lvl>
-    <w:lvl w:ilvl="4" w:tplc="BDE0BF46">
-      <w:numFmt w:val="decimal"/>
-      <w:lvlText w:val=""/>
-      <w:lvlJc w:val="left"/>
-    </w:lvl>
-    <w:lvl w:ilvl="5" w:tplc="654690D8">
-      <w:numFmt w:val="decimal"/>
-      <w:lvlText w:val=""/>
-      <w:lvlJc w:val="left"/>
-    </w:lvl>
-    <w:lvl w:ilvl="6" w:tplc="5C2ECFD2">
-      <w:numFmt w:val="decimal"/>
-      <w:lvlText w:val=""/>
-      <w:lvlJc w:val="left"/>
-    </w:lvl>
-    <w:lvl w:ilvl="7" w:tplc="2CBCB410">
-      <w:numFmt w:val="decimal"/>
-      <w:lvlText w:val=""/>
-      <w:lvlJc w:val="left"/>
-    </w:lvl>
-    <w:lvl w:ilvl="8" w:tplc="47CA8654">
-      <w:numFmt w:val="decimal"/>
-      <w:lvlText w:val=""/>
-      <w:lvlJc w:val="left"/>
-    </w:lvl>
-  </w:abstractNum>
-  <w:num w:numId="1" w16cid:durableId="430855376">
-    <w:abstractNumId w:val="0"/>
+  <w:num w:numId="1" w16cid:durableId="465439749">
+    <w:abstractNumId w:val="2"/>
     <w:lvlOverride w:ilvl="0">
       <w:startOverride w:val="1"/>
     </w:lvlOverride>
   </w:num>
-  <w:num w:numId="2" w16cid:durableId="709305877">
+  <w:num w:numId="2" w16cid:durableId="1688368416">
+    <w:abstractNumId w:val="1"/>
+    <w:lvlOverride w:ilvl="0">
+      <w:startOverride w:val="1"/>
+    </w:lvlOverride>
+  </w:num>
+  <w:num w:numId="3" w16cid:durableId="2005933526">
     <w:abstractNumId w:val="1"/>
     <w:lvlOverride w:ilvl="0">
       <w:startOverride w:val="1"/>
@@ -18916,7 +18922,7 @@
     <w:autoRedefine/>
     <w:uiPriority w:val="39"/>
     <w:unhideWhenUsed/>
-    <w:rsid w:val="00BA6A90"/>
+    <w:rsid w:val="00F95965"/>
     <w:pPr>
       <w:spacing w:after="100"/>
     </w:pPr>
@@ -18928,7 +18934,7 @@
     <w:autoRedefine/>
     <w:uiPriority w:val="39"/>
     <w:unhideWhenUsed/>
-    <w:rsid w:val="00BA6A90"/>
+    <w:rsid w:val="00F95965"/>
     <w:pPr>
       <w:spacing w:after="100"/>
       <w:ind w:left="210"/>

</xml_diff>